<commit_message>
feat: add live AR VR Playground to courseware
</commit_message>
<xml_diff>
--- a/courseware/LG-AI Vibe Coding for Augmented Reality (AR) Applications.docx
+++ b/courseware/LG-AI Vibe Coding for Augmented Reality (AR) Applications.docx
@@ -218,7 +218,7 @@
           <w:color w:val="1F6FEB"/>
           <w:sz w:val="24"/>
         </w:rPr>
-        <w:t>Version 9.0</w:t>
+        <w:t>Version 9.1</w:t>
       </w:r>
     </w:p>
     <w:p>
@@ -438,6 +438,64 @@
           </w:p>
         </w:tc>
       </w:tr>
+      <w:tr>
+        <w:tc>
+          <w:tcPr>
+            <w:tcW w:type="dxa" w:w="2160"/>
+          </w:tcPr>
+          <w:p>
+            <w:r/>
+            <w:r>
+              <w:rPr>
+                <w:sz w:val="19"/>
+              </w:rPr>
+              <w:t>9.1</w:t>
+            </w:r>
+          </w:p>
+        </w:tc>
+        <w:tc>
+          <w:tcPr>
+            <w:tcW w:type="dxa" w:w="2160"/>
+          </w:tcPr>
+          <w:p>
+            <w:r/>
+            <w:r>
+              <w:rPr>
+                <w:sz w:val="19"/>
+              </w:rPr>
+              <w:t>12 September 2026</w:t>
+            </w:r>
+          </w:p>
+        </w:tc>
+        <w:tc>
+          <w:tcPr>
+            <w:tcW w:type="dxa" w:w="2160"/>
+          </w:tcPr>
+          <w:p>
+            <w:r/>
+            <w:r>
+              <w:rPr>
+                <w:sz w:val="19"/>
+              </w:rPr>
+              <w:t>Added the live learner-facing AR/VR Playground across the deck, guide and labs.</w:t>
+            </w:r>
+          </w:p>
+        </w:tc>
+        <w:tc>
+          <w:tcPr>
+            <w:tcW w:type="dxa" w:w="2160"/>
+          </w:tcPr>
+          <w:p>
+            <w:r/>
+            <w:r>
+              <w:rPr>
+                <w:sz w:val="19"/>
+              </w:rPr>
+              <w:t>Dr Alfred Ang</w:t>
+            </w:r>
+          </w:p>
+        </w:tc>
+      </w:tr>
     </w:tbl>
     <w:p>
       <w:r>
@@ -529,9 +587,9 @@
           <w:color w:val="333333"/>
           <w:sz w:val="22"/>
         </w:rPr>
-        <w:t>Localhost AR/VR Vibe Studio</w:t>
+        <w:t>AR/VR Playground</w:t>
         <w:tab/>
-        <w:t>7</w:t>
+        <w:t>6</w:t>
       </w:r>
     </w:p>
     <w:p>
@@ -2840,6 +2898,38 @@
               <w:rPr>
                 <w:b/>
               </w:rPr>
+              <w:t>Live Playground</w:t>
+            </w:r>
+          </w:p>
+        </w:tc>
+        <w:tc>
+          <w:tcPr>
+            <w:tcW w:type="dxa" w:w="4320"/>
+          </w:tcPr>
+          <w:p>
+            <w:hyperlink r:id="rId11">
+              <w:r>
+                <w:rPr>
+                  <w:color w:val="0563C1"/>
+                  <w:u w:val="single"/>
+                </w:rPr>
+                <w:t>https://alfredang.github.io/arvr-playground/</w:t>
+              </w:r>
+            </w:hyperlink>
+          </w:p>
+        </w:tc>
+      </w:tr>
+      <w:tr>
+        <w:tc>
+          <w:tcPr>
+            <w:tcW w:type="dxa" w:w="4320"/>
+            <w:shd w:val="clear" w:color="auto" w:fill="E8F0FE"/>
+          </w:tcPr>
+          <w:p>
+            <w:r>
+              <w:rPr>
+                <w:b/>
+              </w:rPr>
               <w:t>Local application</w:t>
             </w:r>
           </w:p>
@@ -2849,9 +2939,15 @@
             <w:tcW w:type="dxa" w:w="4320"/>
           </w:tcPr>
           <w:p>
-            <w:r>
-              <w:t>http://127.0.0.1:4173/</w:t>
-            </w:r>
+            <w:hyperlink r:id="rId12">
+              <w:r>
+                <w:rPr>
+                  <w:color w:val="0563C1"/>
+                  <w:u w:val="single"/>
+                </w:rPr>
+                <w:t>http://127.0.0.1:4173/</w:t>
+              </w:r>
+            </w:hyperlink>
           </w:p>
         </w:tc>
       </w:tr>
@@ -2863,9 +2959,15 @@
         </w:rPr>
         <w:t xml:space="preserve">Official course page: </w:t>
       </w:r>
-      <w:r>
-        <w:t>https://www.tertiarycourses.com.sg/wsq-ai-vibe-coding-for-augmented-reality-ar-applications.html</w:t>
-      </w:r>
+      <w:hyperlink r:id="rId13">
+        <w:r>
+          <w:rPr>
+            <w:color w:val="0563C1"/>
+            <w:u w:val="single"/>
+          </w:rPr>
+          <w:t>https://www.tertiarycourses.com.sg/wsq-ai-vibe-coding-for-augmented-reality-ar-applications.html</w:t>
+        </w:r>
+      </w:hyperlink>
     </w:p>
     <w:p>
       <w:pPr>
@@ -3312,13 +3414,30 @@
         <w:pStyle w:val="Heading1"/>
       </w:pPr>
       <w:r>
-        <w:t>Localhost AR/VR Vibe Studio</w:t>
+        <w:t>AR/VR Playground</w:t>
       </w:r>
     </w:p>
     <w:p>
       <w:r>
         <w:t>The shared browser application converts a constrained natural-language request into a reviewable scene contract, renders a Three.js desktop preview, exposes AR/VR launch capability, and reports validation evidence. Prompts are parsed locally in the browser.</w:t>
       </w:r>
+    </w:p>
+    <w:p>
+      <w:r>
+        <w:rPr>
+          <w:b/>
+        </w:rPr>
+        <w:t xml:space="preserve">Try the live Playground — no installation required: </w:t>
+      </w:r>
+      <w:hyperlink r:id="rId11">
+        <w:r>
+          <w:rPr>
+            <w:color w:val="0563C1"/>
+            <w:u w:val="single"/>
+          </w:rPr>
+          <w:t>https://alfredang.github.io/arvr-playground/</w:t>
+        </w:r>
+      </w:hyperlink>
     </w:p>
     <w:p>
       <w:pPr>
@@ -3385,9 +3504,15 @@
         </w:rPr>
         <w:t xml:space="preserve">Open the local studio: </w:t>
       </w:r>
-      <w:r>
-        <w:t>http://127.0.0.1:4173/</w:t>
-      </w:r>
+      <w:hyperlink r:id="rId12">
+        <w:r>
+          <w:rPr>
+            <w:color w:val="0563C1"/>
+            <w:u w:val="single"/>
+          </w:rPr>
+          <w:t>http://127.0.0.1:4173/</w:t>
+        </w:r>
+      </w:hyperlink>
     </w:p>
     <w:tbl>
       <w:tblPr>
@@ -3439,7 +3564,7 @@
                     <pic:cNvPicPr/>
                   </pic:nvPicPr>
                   <pic:blipFill>
-                    <a:blip r:embed="rId11"/>
+                    <a:blip r:embed="rId14"/>
                     <a:stretch>
                       <a:fillRect/>
                     </a:stretch>
@@ -14539,6 +14664,23 @@
       </w:r>
     </w:p>
     <w:p>
+      <w:r>
+        <w:rPr>
+          <w:b/>
+        </w:rPr>
+        <w:t xml:space="preserve">Try this scene in the live Playground: </w:t>
+      </w:r>
+      <w:hyperlink r:id="rId11">
+        <w:r>
+          <w:rPr>
+            <w:color w:val="0563C1"/>
+            <w:u w:val="single"/>
+          </w:rPr>
+          <w:t>https://alfredang.github.io/arvr-playground/</w:t>
+        </w:r>
+      </w:hyperlink>
+    </w:p>
+    <w:p>
       <w:pPr>
         <w:jc w:val="center"/>
       </w:pPr>
@@ -14555,953 +14697,6 @@
                 <pic:pic>
                   <pic:nvPicPr>
                     <pic:cNvPr id="0" name="lab-01-tracked-plane.png"/>
-                    <pic:cNvPicPr/>
-                  </pic:nvPicPr>
-                  <pic:blipFill>
-                    <a:blip r:embed="rId12"/>
-                    <a:stretch>
-                      <a:fillRect/>
-                    </a:stretch>
-                  </pic:blipFill>
-                  <pic:spPr>
-                    <a:xfrm>
-                      <a:off x="0" y="0"/>
-                      <a:ext cx="5989320" cy="3368992"/>
-                    </a:xfrm>
-                    <a:prstGeom prst="rect"/>
-                  </pic:spPr>
-                </pic:pic>
-              </a:graphicData>
-            </a:graphic>
-          </wp:inline>
-        </w:drawing>
-      </w:r>
-    </w:p>
-    <w:p>
-      <w:pPr>
-        <w:jc w:val="center"/>
-      </w:pPr>
-      <w:r>
-        <w:t>Workflow visual — tracked plane and anchor evidence. Detail is supplied in the lab asset folder.</w:t>
-      </w:r>
-    </w:p>
-    <w:p>
-      <w:pPr>
-        <w:pStyle w:val="Heading2"/>
-      </w:pPr>
-      <w:r>
-        <w:t>Before you start</w:t>
-      </w:r>
-    </w:p>
-    <w:p>
-      <w:pPr>
-        <w:pStyle w:val="ListBullet"/>
-      </w:pPr>
-      <w:r>
-        <w:t>Use a current Node.js LTS release and a Chromium-based browser.</w:t>
-      </w:r>
-    </w:p>
-    <w:p>
-      <w:pPr>
-        <w:pStyle w:val="ListBullet"/>
-      </w:pPr>
-      <w:r>
-        <w:t>Keep credentials, learner data and private client material out of coding-agent prompts.</w:t>
-      </w:r>
-    </w:p>
-    <w:p>
-      <w:pPr>
-        <w:pStyle w:val="ListBullet"/>
-      </w:pPr>
-      <w:r>
-        <w:t>Inspect every proposed diff and require automated plus runtime evidence.</w:t>
-      </w:r>
-    </w:p>
-    <w:p>
-      <w:pPr>
-        <w:pStyle w:val="ListBullet"/>
-      </w:pPr>
-      <w:r>
-        <w:t>Clear a safe physical area before immersive testing.</w:t>
-      </w:r>
-    </w:p>
-    <w:p>
-      <w:pPr>
-        <w:pStyle w:val="Heading2"/>
-      </w:pPr>
-      <w:r>
-        <w:t>Detailed procedure</w:t>
-      </w:r>
-    </w:p>
-    <w:p>
-      <w:pPr>
-        <w:pStyle w:val="ListNumber"/>
-      </w:pPr>
-      <w:r>
-        <w:t>Read `assets/equipment-spec.md`; highlight the physical size, operating context, safety boundary, and information the technician must see.</w:t>
-      </w:r>
-    </w:p>
-    <w:p>
-      <w:pPr>
-        <w:pStyle w:val="ListNumber"/>
-      </w:pPr>
-      <w:r>
-        <w:t>Start the shared localhost studio with `./start.command`; open the printed URL in a Chromium-based browser.</w:t>
-      </w:r>
-    </w:p>
-    <w:p>
-      <w:pPr>
-        <w:pStyle w:val="ListNumber"/>
-      </w:pPr>
-      <w:r>
-        <w:t>Paste the baseline request from `vibe-script.md` into the studio and select **Infer from prompt**.</w:t>
-      </w:r>
-    </w:p>
-    <w:p>
-      <w:pPr>
-        <w:pStyle w:val="ListNumber"/>
-      </w:pPr>
-      <w:r>
-        <w:t>Generate the scene, then inspect the JSON contract before judging the 3D preview.</w:t>
-      </w:r>
-    </w:p>
-    <w:p>
-      <w:pPr>
-        <w:pStyle w:val="ListNumber"/>
-      </w:pPr>
-      <w:r>
-        <w:t>Compare `targetMode`, `tracking`, `scaleMetres`, callout count, and performance budgets with the equipment specification.</w:t>
-      </w:r>
-    </w:p>
-    <w:p>
-      <w:pPr>
-        <w:pStyle w:val="ListNumber"/>
-      </w:pPr>
-      <w:r>
-        <w:t>Run the refinement prompt so the coding agent changes one contract rule at a time and preserves the schema.</w:t>
-      </w:r>
-    </w:p>
-    <w:p>
-      <w:pPr>
-        <w:pStyle w:val="ListNumber"/>
-      </w:pPr>
-      <w:r>
-        <w:t>Export the scene as `evidence/lab-01-scene.json`; capture the preview and Checks tab as screenshots.</w:t>
-      </w:r>
-    </w:p>
-    <w:p>
-      <w:pPr>
-        <w:pStyle w:val="ListNumber"/>
-      </w:pPr>
-      <w:r>
-        <w:t>Run `node verify.mjs` and retain the PASS output as assessment evidence.</w:t>
-      </w:r>
-    </w:p>
-    <w:p>
-      <w:pPr>
-        <w:pStyle w:val="Heading2"/>
-      </w:pPr>
-      <w:r>
-        <w:t>Test it</w:t>
-      </w:r>
-    </w:p>
-    <w:p>
-      <w:pPr>
-        <w:pStyle w:val="ListBullet"/>
-      </w:pPr>
-      <w:r>
-        <w:t>☐ schema is ar-vr-vibe-scene/v1</w:t>
-      </w:r>
-    </w:p>
-    <w:p>
-      <w:pPr>
-        <w:pStyle w:val="ListBullet"/>
-      </w:pPr>
-      <w:r>
-        <w:t>☐ target mode is AR</w:t>
-      </w:r>
-    </w:p>
-    <w:p>
-      <w:pPr>
-        <w:pStyle w:val="ListBullet"/>
-      </w:pPr>
-      <w:r>
-        <w:t>☐ subject is turbine</w:t>
-      </w:r>
-    </w:p>
-    <w:p>
-      <w:pPr>
-        <w:pStyle w:val="ListBullet"/>
-      </w:pPr>
-      <w:r>
-        <w:t>☐ three callouts are declared</w:t>
-      </w:r>
-    </w:p>
-    <w:p>
-      <w:pPr>
-        <w:pStyle w:val="ListBullet"/>
-      </w:pPr>
-      <w:r>
-        <w:t>☐ scale is expressed in metres</w:t>
-      </w:r>
-    </w:p>
-    <w:p>
-      <w:r>
-        <w:rPr>
-          <w:rFonts w:ascii="Consolas" w:hAnsi="Consolas"/>
-          <w:color w:val="0B3060"/>
-          <w:sz w:val="18"/>
-        </w:rPr>
-        <w:t>node labs/lab-01-scene-brief-and-prompt-contract/verify.mjs</w:t>
-      </w:r>
-    </w:p>
-    <w:tbl>
-      <w:tblPr>
-        <w:tblStyle w:val="TableGrid"/>
-        <w:tblW w:type="auto" w:w="0"/>
-        <w:tblLook w:firstColumn="1" w:firstRow="1" w:lastColumn="0" w:lastRow="0" w:noHBand="0" w:noVBand="1" w:val="04A0"/>
-      </w:tblPr>
-      <w:tblGrid>
-        <w:gridCol w:w="8640"/>
-      </w:tblGrid>
-      <w:tr>
-        <w:tc>
-          <w:tcPr>
-            <w:tcW w:type="dxa" w:w="8640"/>
-            <w:shd w:val="clear" w:color="auto" w:fill="F5F8FC"/>
-          </w:tcPr>
-          <w:p>
-            <w:r>
-              <w:rPr>
-                <w:b/>
-                <w:color w:val="109979"/>
-              </w:rPr>
-              <w:t xml:space="preserve">Expected: </w:t>
-            </w:r>
-            <w:r>
-              <w:t>The final output is PASS Lab 01.</w:t>
-            </w:r>
-          </w:p>
-        </w:tc>
-      </w:tr>
-    </w:tbl>
-    <w:p>
-      <w:pPr>
-        <w:pStyle w:val="Heading2"/>
-      </w:pPr>
-      <w:r>
-        <w:t>Troubleshooting</w:t>
-      </w:r>
-    </w:p>
-    <w:p>
-      <w:pPr>
-        <w:pStyle w:val="ListBullet"/>
-      </w:pPr>
-      <w:r>
-        <w:t>If npm is missing, install the current Node.js LTS release and reopen Terminal.</w:t>
-      </w:r>
-    </w:p>
-    <w:p>
-      <w:pPr>
-        <w:pStyle w:val="ListBullet"/>
-      </w:pPr>
-      <w:r>
-        <w:t>If the viewport is blank, reload once and check the browser console for WebGL errors.</w:t>
-      </w:r>
-    </w:p>
-    <w:p>
-      <w:pPr>
-        <w:pStyle w:val="ListBullet"/>
-      </w:pPr>
-      <w:r>
-        <w:t>If the inferred mode is wrong, make `AR` explicit or choose the AR override.</w:t>
-      </w:r>
-    </w:p>
-    <w:p>
-      <w:pPr>
-        <w:pStyle w:val="Heading2"/>
-      </w:pPr>
-      <w:r>
-        <w:t>Cleanup</w:t>
-      </w:r>
-    </w:p>
-    <w:p>
-      <w:r>
-        <w:t>Stop the Vite server with Control-C. Keep only the exported JSON and evidence screenshots; do not commit `node_modules/` or `.env` files.</w:t>
-      </w:r>
-    </w:p>
-    <w:p>
-      <w:r>
-        <w:rPr>
-          <w:i/>
-        </w:rPr>
-        <w:t>Detailed lab file: labs/lab-01-scene-brief-and-prompt-contract/README.md</w:t>
-      </w:r>
-    </w:p>
-    <w:p>
-      <w:pPr>
-        <w:pStyle w:val="Heading1"/>
-      </w:pPr>
-      <w:r>
-        <w:t>Lab 02 — Storyboard and Spatial UI</w:t>
-      </w:r>
-    </w:p>
-    <w:p>
-      <w:r>
-        <w:rPr>
-          <w:b/>
-        </w:rPr>
-        <w:t>Duration: 75 minutes · Alignment: LO1 · K1 · K2 · A2</w:t>
-      </w:r>
-    </w:p>
-    <w:p>
-      <w:r>
-        <w:t>Convert an AR user journey into four observable states and apply readable, reachable spatial UI rules.</w:t>
-      </w:r>
-    </w:p>
-    <w:p>
-      <w:pPr>
-        <w:jc w:val="center"/>
-      </w:pPr>
-      <w:r>
-        <w:drawing>
-          <wp:inline xmlns:a="http://schemas.openxmlformats.org/drawingml/2006/main" xmlns:pic="http://schemas.openxmlformats.org/drawingml/2006/picture">
-            <wp:extent cx="5989320" cy="3368992"/>
-            <wp:docPr id="5" name="Picture 5"/>
-            <wp:cNvGraphicFramePr>
-              <a:graphicFrameLocks noChangeAspect="1"/>
-            </wp:cNvGraphicFramePr>
-            <a:graphic>
-              <a:graphicData uri="http://schemas.openxmlformats.org/drawingml/2006/picture">
-                <pic:pic>
-                  <pic:nvPicPr>
-                    <pic:cNvPr id="0" name="lab-02-tracked-plane.png"/>
-                    <pic:cNvPicPr/>
-                  </pic:nvPicPr>
-                  <pic:blipFill>
-                    <a:blip r:embed="rId13"/>
-                    <a:stretch>
-                      <a:fillRect/>
-                    </a:stretch>
-                  </pic:blipFill>
-                  <pic:spPr>
-                    <a:xfrm>
-                      <a:off x="0" y="0"/>
-                      <a:ext cx="5989320" cy="3368992"/>
-                    </a:xfrm>
-                    <a:prstGeom prst="rect"/>
-                  </pic:spPr>
-                </pic:pic>
-              </a:graphicData>
-            </a:graphic>
-          </wp:inline>
-        </w:drawing>
-      </w:r>
-    </w:p>
-    <w:p>
-      <w:pPr>
-        <w:jc w:val="center"/>
-      </w:pPr>
-      <w:r>
-        <w:t>Workflow visual — tracked plane and anchor evidence. Detail is supplied in the lab asset folder.</w:t>
-      </w:r>
-    </w:p>
-    <w:p>
-      <w:pPr>
-        <w:pStyle w:val="Heading2"/>
-      </w:pPr>
-      <w:r>
-        <w:t>Before you start</w:t>
-      </w:r>
-    </w:p>
-    <w:p>
-      <w:pPr>
-        <w:pStyle w:val="ListBullet"/>
-      </w:pPr>
-      <w:r>
-        <w:t>Use a current Node.js LTS release and a Chromium-based browser.</w:t>
-      </w:r>
-    </w:p>
-    <w:p>
-      <w:pPr>
-        <w:pStyle w:val="ListBullet"/>
-      </w:pPr>
-      <w:r>
-        <w:t>Keep credentials, learner data and private client material out of coding-agent prompts.</w:t>
-      </w:r>
-    </w:p>
-    <w:p>
-      <w:pPr>
-        <w:pStyle w:val="ListBullet"/>
-      </w:pPr>
-      <w:r>
-        <w:t>Inspect every proposed diff and require automated plus runtime evidence.</w:t>
-      </w:r>
-    </w:p>
-    <w:p>
-      <w:pPr>
-        <w:pStyle w:val="ListBullet"/>
-      </w:pPr>
-      <w:r>
-        <w:t>Clear a safe physical area before immersive testing.</w:t>
-      </w:r>
-    </w:p>
-    <w:p>
-      <w:pPr>
-        <w:pStyle w:val="Heading2"/>
-      </w:pPr>
-      <w:r>
-        <w:t>Detailed procedure</w:t>
-      </w:r>
-    </w:p>
-    <w:p>
-      <w:pPr>
-        <w:pStyle w:val="ListNumber"/>
-      </w:pPr>
-      <w:r>
-        <w:t>Open `assets/storyboard-template.svg` and identify the Entry, Orient, Act, and Confirm evidence required in each frame.</w:t>
-      </w:r>
-    </w:p>
-    <w:p>
-      <w:pPr>
-        <w:pStyle w:val="ListNumber"/>
-      </w:pPr>
-      <w:r>
-        <w:t>Start the localhost studio and select the **Storyboard** inspector tab.</w:t>
-      </w:r>
-    </w:p>
-    <w:p>
-      <w:pPr>
-        <w:pStyle w:val="ListNumber"/>
-      </w:pPr>
-      <w:r>
-        <w:t>Run the baseline vibe prompt; confirm the generated sequence contains four distinct states rather than four decorative screens.</w:t>
-      </w:r>
-    </w:p>
-    <w:p>
-      <w:pPr>
-        <w:pStyle w:val="ListNumber"/>
-      </w:pPr>
-      <w:r>
-        <w:t>Check that Orient exposes plane detection/placement, Act names the interaction, and Confirm shows an observable completion signal.</w:t>
-      </w:r>
-    </w:p>
-    <w:p>
-      <w:pPr>
-        <w:pStyle w:val="ListNumber"/>
-      </w:pPr>
-      <w:r>
-        <w:t>Use the critique prompt to test label contrast, angular size, occlusion, reachability, and motion comfort.</w:t>
-      </w:r>
-    </w:p>
-    <w:p>
-      <w:pPr>
-        <w:pStyle w:val="ListNumber"/>
-      </w:pPr>
-      <w:r>
-        <w:t>Change one UI constraint, regenerate, and compare the previous and revised contract side by side.</w:t>
-      </w:r>
-    </w:p>
-    <w:p>
-      <w:pPr>
-        <w:pStyle w:val="ListNumber"/>
-      </w:pPr>
-      <w:r>
-        <w:t>Complete `assets/ui-review-checklist.md` with pass/fail evidence for each rule.</w:t>
-      </w:r>
-    </w:p>
-    <w:p>
-      <w:pPr>
-        <w:pStyle w:val="ListNumber"/>
-      </w:pPr>
-      <w:r>
-        <w:t>Export the scene and run `node verify.mjs`.</w:t>
-      </w:r>
-    </w:p>
-    <w:p>
-      <w:pPr>
-        <w:pStyle w:val="Heading2"/>
-      </w:pPr>
-      <w:r>
-        <w:t>Test it</w:t>
-      </w:r>
-    </w:p>
-    <w:p>
-      <w:pPr>
-        <w:pStyle w:val="ListBullet"/>
-      </w:pPr>
-      <w:r>
-        <w:t>☐ storyboard has four states</w:t>
-      </w:r>
-    </w:p>
-    <w:p>
-      <w:pPr>
-        <w:pStyle w:val="ListBullet"/>
-      </w:pPr>
-      <w:r>
-        <w:t>☐ high-contrast labels are enabled</w:t>
-      </w:r>
-    </w:p>
-    <w:p>
-      <w:pPr>
-        <w:pStyle w:val="ListBullet"/>
-      </w:pPr>
-      <w:r>
-        <w:t>☐ reduced-motion control is present</w:t>
-      </w:r>
-    </w:p>
-    <w:p>
-      <w:pPr>
-        <w:pStyle w:val="ListBullet"/>
-      </w:pPr>
-      <w:r>
-        <w:t>☐ tap interaction is declared</w:t>
-      </w:r>
-    </w:p>
-    <w:p>
-      <w:r>
-        <w:rPr>
-          <w:rFonts w:ascii="Consolas" w:hAnsi="Consolas"/>
-          <w:color w:val="0B3060"/>
-          <w:sz w:val="18"/>
-        </w:rPr>
-        <w:t>node labs/lab-02-storyboard-and-spatial-ui/verify.mjs</w:t>
-      </w:r>
-    </w:p>
-    <w:tbl>
-      <w:tblPr>
-        <w:tblStyle w:val="TableGrid"/>
-        <w:tblW w:type="auto" w:w="0"/>
-        <w:tblLook w:firstColumn="1" w:firstRow="1" w:lastColumn="0" w:lastRow="0" w:noHBand="0" w:noVBand="1" w:val="04A0"/>
-      </w:tblPr>
-      <w:tblGrid>
-        <w:gridCol w:w="8640"/>
-      </w:tblGrid>
-      <w:tr>
-        <w:tc>
-          <w:tcPr>
-            <w:tcW w:type="dxa" w:w="8640"/>
-            <w:shd w:val="clear" w:color="auto" w:fill="F5F8FC"/>
-          </w:tcPr>
-          <w:p>
-            <w:r>
-              <w:rPr>
-                <w:b/>
-                <w:color w:val="109979"/>
-              </w:rPr>
-              <w:t xml:space="preserve">Expected: </w:t>
-            </w:r>
-            <w:r>
-              <w:t>The final output is PASS Lab 02.</w:t>
-            </w:r>
-          </w:p>
-        </w:tc>
-      </w:tr>
-    </w:tbl>
-    <w:p>
-      <w:pPr>
-        <w:pStyle w:val="Heading2"/>
-      </w:pPr>
-      <w:r>
-        <w:t>Troubleshooting</w:t>
-      </w:r>
-    </w:p>
-    <w:p>
-      <w:pPr>
-        <w:pStyle w:val="ListBullet"/>
-      </w:pPr>
-      <w:r>
-        <w:t>If a storyboard frame is vague, rewrite it as a visible state plus user action plus evidence.</w:t>
-      </w:r>
-    </w:p>
-    <w:p>
-      <w:pPr>
-        <w:pStyle w:val="ListBullet"/>
-      </w:pPr>
-      <w:r>
-        <w:t>If labels disappear, enable Spatial callouts in Runtime controls.</w:t>
-      </w:r>
-    </w:p>
-    <w:p>
-      <w:pPr>
-        <w:pStyle w:val="ListBullet"/>
-      </w:pPr>
-      <w:r>
-        <w:t>If mobile text is cramped, use the 390 px responsive layout and verify there is no horizontal overflow.</w:t>
-      </w:r>
-    </w:p>
-    <w:p>
-      <w:pPr>
-        <w:pStyle w:val="Heading2"/>
-      </w:pPr>
-      <w:r>
-        <w:t>Cleanup</w:t>
-      </w:r>
-    </w:p>
-    <w:p>
-      <w:r>
-        <w:t>Stop the server and keep the completed UI review plus exported scene in the evidence folder.</w:t>
-      </w:r>
-    </w:p>
-    <w:p>
-      <w:r>
-        <w:rPr>
-          <w:i/>
-        </w:rPr>
-        <w:t>Detailed lab file: labs/lab-02-storyboard-and-spatial-ui/README.md</w:t>
-      </w:r>
-    </w:p>
-    <w:p>
-      <w:pPr>
-        <w:pStyle w:val="Heading1"/>
-      </w:pPr>
-      <w:r>
-        <w:t>Lab 03 — WebXR Capability and Equipment Gate</w:t>
-      </w:r>
-    </w:p>
-    <w:p>
-      <w:r>
-        <w:rPr>
-          <w:b/>
-        </w:rPr>
-        <w:t>Duration: 60 minutes · Alignment: LO1 · K3 · K5</w:t>
-      </w:r>
-    </w:p>
-    <w:p>
-      <w:r>
-        <w:t>Detect browser/device capability and route learners to AR, VR, or desktop fallback without a dead-end experience.</w:t>
-      </w:r>
-    </w:p>
-    <w:p>
-      <w:pPr>
-        <w:jc w:val="center"/>
-      </w:pPr>
-      <w:r>
-        <w:drawing>
-          <wp:inline xmlns:a="http://schemas.openxmlformats.org/drawingml/2006/main" xmlns:pic="http://schemas.openxmlformats.org/drawingml/2006/picture">
-            <wp:extent cx="5989320" cy="3368992"/>
-            <wp:docPr id="6" name="Picture 6"/>
-            <wp:cNvGraphicFramePr>
-              <a:graphicFrameLocks noChangeAspect="1"/>
-            </wp:cNvGraphicFramePr>
-            <a:graphic>
-              <a:graphicData uri="http://schemas.openxmlformats.org/drawingml/2006/picture">
-                <pic:pic>
-                  <pic:nvPicPr>
-                    <pic:cNvPr id="0" name="lab-03-tracked-plane.png"/>
-                    <pic:cNvPicPr/>
-                  </pic:nvPicPr>
-                  <pic:blipFill>
-                    <a:blip r:embed="rId14"/>
-                    <a:stretch>
-                      <a:fillRect/>
-                    </a:stretch>
-                  </pic:blipFill>
-                  <pic:spPr>
-                    <a:xfrm>
-                      <a:off x="0" y="0"/>
-                      <a:ext cx="5989320" cy="3368992"/>
-                    </a:xfrm>
-                    <a:prstGeom prst="rect"/>
-                  </pic:spPr>
-                </pic:pic>
-              </a:graphicData>
-            </a:graphic>
-          </wp:inline>
-        </w:drawing>
-      </w:r>
-    </w:p>
-    <w:p>
-      <w:pPr>
-        <w:jc w:val="center"/>
-      </w:pPr>
-      <w:r>
-        <w:t>Workflow visual — tracked plane and anchor evidence. Detail is supplied in the lab asset folder.</w:t>
-      </w:r>
-    </w:p>
-    <w:p>
-      <w:pPr>
-        <w:pStyle w:val="Heading2"/>
-      </w:pPr>
-      <w:r>
-        <w:t>Before you start</w:t>
-      </w:r>
-    </w:p>
-    <w:p>
-      <w:pPr>
-        <w:pStyle w:val="ListBullet"/>
-      </w:pPr>
-      <w:r>
-        <w:t>Use a current Node.js LTS release and a Chromium-based browser.</w:t>
-      </w:r>
-    </w:p>
-    <w:p>
-      <w:pPr>
-        <w:pStyle w:val="ListBullet"/>
-      </w:pPr>
-      <w:r>
-        <w:t>Keep credentials, learner data and private client material out of coding-agent prompts.</w:t>
-      </w:r>
-    </w:p>
-    <w:p>
-      <w:pPr>
-        <w:pStyle w:val="ListBullet"/>
-      </w:pPr>
-      <w:r>
-        <w:t>Inspect every proposed diff and require automated plus runtime evidence.</w:t>
-      </w:r>
-    </w:p>
-    <w:p>
-      <w:pPr>
-        <w:pStyle w:val="ListBullet"/>
-      </w:pPr>
-      <w:r>
-        <w:t>Clear a safe physical area before immersive testing.</w:t>
-      </w:r>
-    </w:p>
-    <w:p>
-      <w:pPr>
-        <w:pStyle w:val="Heading2"/>
-      </w:pPr>
-      <w:r>
-        <w:t>Detailed procedure</w:t>
-      </w:r>
-    </w:p>
-    <w:p>
-      <w:pPr>
-        <w:pStyle w:val="ListNumber"/>
-      </w:pPr>
-      <w:r>
-        <w:t>Review `assets/capability-matrix.csv` and identify which combinations should enable AR, VR, or desktop preview.</w:t>
-      </w:r>
-    </w:p>
-    <w:p>
-      <w:pPr>
-        <w:pStyle w:val="ListNumber"/>
-      </w:pPr>
-      <w:r>
-        <w:t>Open the studio on desktop and record the actual AR/VR button states.</w:t>
-      </w:r>
-    </w:p>
-    <w:p>
-      <w:pPr>
-        <w:pStyle w:val="ListNumber"/>
-      </w:pPr>
-      <w:r>
-        <w:t>Use DevTools Console to inspect `window.isSecureContext`, `navigator.xr`, and WebGL renderer availability.</w:t>
-      </w:r>
-    </w:p>
-    <w:p>
-      <w:pPr>
-        <w:pStyle w:val="ListNumber"/>
-      </w:pPr>
-      <w:r>
-        <w:t>Run the vibe prompt and require a plan, minimal diff, and automated tests before accepting changes.</w:t>
-      </w:r>
-    </w:p>
-    <w:p>
-      <w:pPr>
-        <w:pStyle w:val="ListNumber"/>
-      </w:pPr>
-      <w:r>
-        <w:t>Simulate an unsupported browser condition and confirm the app keeps the desktop preview available.</w:t>
-      </w:r>
-    </w:p>
-    <w:p>
-      <w:pPr>
-        <w:pStyle w:val="ListNumber"/>
-      </w:pPr>
-      <w:r>
-        <w:t>Inspect the user message: it must name the missing capability and the safe next action without blaming cache.</w:t>
-      </w:r>
-    </w:p>
-    <w:p>
-      <w:pPr>
-        <w:pStyle w:val="ListNumber"/>
-      </w:pPr>
-      <w:r>
-        <w:t>Complete the capability decision table with observed device/browser evidence.</w:t>
-      </w:r>
-    </w:p>
-    <w:p>
-      <w:pPr>
-        <w:pStyle w:val="ListNumber"/>
-      </w:pPr>
-      <w:r>
-        <w:t>Run `npm test` in `webapp/` and `node verify.mjs` in this lab.</w:t>
-      </w:r>
-    </w:p>
-    <w:p>
-      <w:pPr>
-        <w:pStyle w:val="Heading2"/>
-      </w:pPr>
-      <w:r>
-        <w:t>Test it</w:t>
-      </w:r>
-    </w:p>
-    <w:p>
-      <w:pPr>
-        <w:pStyle w:val="ListBullet"/>
-      </w:pPr>
-      <w:r>
-        <w:t>☐ desktop fallback remains available</w:t>
-      </w:r>
-    </w:p>
-    <w:p>
-      <w:pPr>
-        <w:pStyle w:val="ListBullet"/>
-      </w:pPr>
-      <w:r>
-        <w:t>☐ mode is explicit</w:t>
-      </w:r>
-    </w:p>
-    <w:p>
-      <w:pPr>
-        <w:pStyle w:val="ListBullet"/>
-      </w:pPr>
-      <w:r>
-        <w:t>☐ runtime budget is declared</w:t>
-      </w:r>
-    </w:p>
-    <w:p>
-      <w:pPr>
-        <w:pStyle w:val="ListBullet"/>
-      </w:pPr>
-      <w:r>
-        <w:t>☐ unsupported WebXR is communicated</w:t>
-      </w:r>
-    </w:p>
-    <w:p>
-      <w:r>
-        <w:rPr>
-          <w:rFonts w:ascii="Consolas" w:hAnsi="Consolas"/>
-          <w:color w:val="0B3060"/>
-          <w:sz w:val="18"/>
-        </w:rPr>
-        <w:t>node labs/lab-03-webxr-capability-and-equipment-gate/verify.mjs</w:t>
-      </w:r>
-    </w:p>
-    <w:tbl>
-      <w:tblPr>
-        <w:tblStyle w:val="TableGrid"/>
-        <w:tblW w:type="auto" w:w="0"/>
-        <w:tblLook w:firstColumn="1" w:firstRow="1" w:lastColumn="0" w:lastRow="0" w:noHBand="0" w:noVBand="1" w:val="04A0"/>
-      </w:tblPr>
-      <w:tblGrid>
-        <w:gridCol w:w="8640"/>
-      </w:tblGrid>
-      <w:tr>
-        <w:tc>
-          <w:tcPr>
-            <w:tcW w:type="dxa" w:w="8640"/>
-            <w:shd w:val="clear" w:color="auto" w:fill="F5F8FC"/>
-          </w:tcPr>
-          <w:p>
-            <w:r>
-              <w:rPr>
-                <w:b/>
-                <w:color w:val="109979"/>
-              </w:rPr>
-              <w:t xml:space="preserve">Expected: </w:t>
-            </w:r>
-            <w:r>
-              <w:t>The final output is PASS Lab 03.</w:t>
-            </w:r>
-          </w:p>
-        </w:tc>
-      </w:tr>
-    </w:tbl>
-    <w:p>
-      <w:pPr>
-        <w:pStyle w:val="Heading2"/>
-      </w:pPr>
-      <w:r>
-        <w:t>Troubleshooting</w:t>
-      </w:r>
-    </w:p>
-    <w:p>
-      <w:pPr>
-        <w:pStyle w:val="ListBullet"/>
-      </w:pPr>
-      <w:r>
-        <w:t>WebXR immersive sessions require HTTPS or localhost; use the exact local URL printed by Vite.</w:t>
-      </w:r>
-    </w:p>
-    <w:p>
-      <w:pPr>
-        <w:pStyle w:val="ListBullet"/>
-      </w:pPr>
-      <w:r>
-        <w:t>Safari desktop may expose no immersive WebXR; use desktop preview for code review.</w:t>
-      </w:r>
-    </w:p>
-    <w:p>
-      <w:pPr>
-        <w:pStyle w:val="ListBullet"/>
-      </w:pPr>
-      <w:r>
-        <w:t>If WebGL is disabled, confirm hardware acceleration before changing application code.</w:t>
-      </w:r>
-    </w:p>
-    <w:p>
-      <w:pPr>
-        <w:pStyle w:val="Heading2"/>
-      </w:pPr>
-      <w:r>
-        <w:t>Cleanup</w:t>
-      </w:r>
-    </w:p>
-    <w:p>
-      <w:r>
-        <w:t>Close DevTools device simulation, stop the server, and retain the completed capability matrix.</w:t>
-      </w:r>
-    </w:p>
-    <w:p>
-      <w:r>
-        <w:rPr>
-          <w:i/>
-        </w:rPr>
-        <w:t>Detailed lab file: labs/lab-03-webxr-capability-and-equipment-gate/README.md</w:t>
-      </w:r>
-    </w:p>
-    <w:p>
-      <w:pPr>
-        <w:pStyle w:val="Heading1"/>
-      </w:pPr>
-      <w:r>
-        <w:t>Lab 04 — Scene Graph, Lighting and Animation</w:t>
-      </w:r>
-    </w:p>
-    <w:p>
-      <w:r>
-        <w:rPr>
-          <w:b/>
-        </w:rPr>
-        <w:t>Duration: 90 minutes · Alignment: LO2 · K4 · K5</w:t>
-      </w:r>
-    </w:p>
-    <w:p>
-      <w:r>
-        <w:t>Build a deterministic Three.js scene graph and explain how transforms, lighting, render loop, and cleanup interact.</w:t>
-      </w:r>
-    </w:p>
-    <w:p>
-      <w:pPr>
-        <w:jc w:val="center"/>
-      </w:pPr>
-      <w:r>
-        <w:drawing>
-          <wp:inline xmlns:a="http://schemas.openxmlformats.org/drawingml/2006/main" xmlns:pic="http://schemas.openxmlformats.org/drawingml/2006/picture">
-            <wp:extent cx="5989320" cy="3368992"/>
-            <wp:docPr id="7" name="Picture 7"/>
-            <wp:cNvGraphicFramePr>
-              <a:graphicFrameLocks noChangeAspect="1"/>
-            </wp:cNvGraphicFramePr>
-            <a:graphic>
-              <a:graphicData uri="http://schemas.openxmlformats.org/drawingml/2006/picture">
-                <pic:pic>
-                  <pic:nvPicPr>
-                    <pic:cNvPr id="0" name="lab-04-tracked-plane.png"/>
                     <pic:cNvPicPr/>
                   </pic:nvPicPr>
                   <pic:blipFill>
@@ -15585,7 +14780,7 @@
         <w:pStyle w:val="ListNumber"/>
       </w:pPr>
       <w:r>
-        <w:t>Trace `Scene → generatedRoot → Group → Mesh` in `assets/scene-graph.svg` and predict which transform affects every generated object.</w:t>
+        <w:t>Read `assets/equipment-spec.md`; highlight the physical size, operating context, safety boundary, and information the technician must see.</w:t>
       </w:r>
     </w:p>
     <w:p>
@@ -15593,7 +14788,7 @@
         <w:pStyle w:val="ListNumber"/>
       </w:pPr>
       <w:r>
-        <w:t>Open `webapp/src/main.js`; locate scene creation, `generatedRoot`, `buildGeneratedScene()`, and `setAnimationLoop()`.</w:t>
+        <w:t>Start the shared localhost studio with `./start.command`; open the printed URL in a Chromium-based browser.</w:t>
       </w:r>
     </w:p>
     <w:p>
@@ -15601,7 +14796,7 @@
         <w:pStyle w:val="ListNumber"/>
       </w:pPr>
       <w:r>
-        <w:t>Run the vibe prompt and reject any response that replaces tested code without first explaining the object lifecycle.</w:t>
+        <w:t>Paste the baseline request from `vibe-script.md` into the studio and select **Infer from prompt**.</w:t>
       </w:r>
     </w:p>
     <w:p>
@@ -15609,7 +14804,7 @@
         <w:pStyle w:val="ListNumber"/>
       </w:pPr>
       <w:r>
-        <w:t>Generate a three-object desktop scene and inspect the hierarchy through console logging or the provided contract.</w:t>
+        <w:t>Generate the scene, then inspect the JSON contract before judging the 3D preview.</w:t>
       </w:r>
     </w:p>
     <w:p>
@@ -15617,7 +14812,7 @@
         <w:pStyle w:val="ListNumber"/>
       </w:pPr>
       <w:r>
-        <w:t>Toggle motion and confirm the render loop changes behaviour without rebuilding the whole scene.</w:t>
+        <w:t>Compare `targetMode`, `tracking`, `scaleMetres`, callout count, and performance budgets with the equipment specification.</w:t>
       </w:r>
     </w:p>
     <w:p>
@@ -15625,7 +14820,7 @@
         <w:pStyle w:val="ListNumber"/>
       </w:pPr>
       <w:r>
-        <w:t>Generate ten variations and watch memory/console output for disposal errors or steadily increasing resources.</w:t>
+        <w:t>Run the refinement prompt so the coding agent changes one contract rule at a time and preserves the schema.</w:t>
       </w:r>
     </w:p>
     <w:p>
@@ -15633,7 +14828,7 @@
         <w:pStyle w:val="ListNumber"/>
       </w:pPr>
       <w:r>
-        <w:t>Record the before/after draw-call and FPS evidence in `evidence/runtime-review.md`.</w:t>
+        <w:t>Export the scene as `evidence/lab-01-scene.json`; capture the preview and Checks tab as screenshots.</w:t>
       </w:r>
     </w:p>
     <w:p>
@@ -15641,7 +14836,7 @@
         <w:pStyle w:val="ListNumber"/>
       </w:pPr>
       <w:r>
-        <w:t>Run the webapp tests, production build, and lab verifier.</w:t>
+        <w:t>Run `node verify.mjs` and retain the PASS output as assessment evidence.</w:t>
       </w:r>
     </w:p>
     <w:p>
@@ -15657,7 +14852,7 @@
         <w:pStyle w:val="ListBullet"/>
       </w:pPr>
       <w:r>
-        <w:t>☐ generated root uses metric scale</w:t>
+        <w:t>☐ schema is ar-vr-vibe-scene/v1</w:t>
       </w:r>
     </w:p>
     <w:p>
@@ -15665,7 +14860,7 @@
         <w:pStyle w:val="ListBullet"/>
       </w:pPr>
       <w:r>
-        <w:t>☐ animation can be disabled</w:t>
+        <w:t>☐ target mode is AR</w:t>
       </w:r>
     </w:p>
     <w:p>
@@ -15673,7 +14868,7 @@
         <w:pStyle w:val="ListBullet"/>
       </w:pPr>
       <w:r>
-        <w:t>☐ performance budget is explicit</w:t>
+        <w:t>☐ subject is turbine</w:t>
       </w:r>
     </w:p>
     <w:p>
@@ -15681,7 +14876,15 @@
         <w:pStyle w:val="ListBullet"/>
       </w:pPr>
       <w:r>
-        <w:t>☐ cleanup/disposal is documented</w:t>
+        <w:t>☐ three callouts are declared</w:t>
+      </w:r>
+    </w:p>
+    <w:p>
+      <w:pPr>
+        <w:pStyle w:val="ListBullet"/>
+      </w:pPr>
+      <w:r>
+        <w:t>☐ scale is expressed in metres</w:t>
       </w:r>
     </w:p>
     <w:p>
@@ -15691,7 +14894,7 @@
           <w:color w:val="0B3060"/>
           <w:sz w:val="18"/>
         </w:rPr>
-        <w:t>node labs/lab-04-scene-graph-lighting-and-animation/verify.mjs</w:t>
+        <w:t>node labs/lab-01-scene-brief-and-prompt-contract/verify.mjs</w:t>
       </w:r>
     </w:p>
     <w:tbl>
@@ -15718,7 +14921,7 @@
               <w:t xml:space="preserve">Expected: </w:t>
             </w:r>
             <w:r>
-              <w:t>The final output is PASS Lab 04.</w:t>
+              <w:t>The final output is PASS Lab 01.</w:t>
             </w:r>
           </w:p>
         </w:tc>
@@ -15737,7 +14940,7 @@
         <w:pStyle w:val="ListBullet"/>
       </w:pPr>
       <w:r>
-        <w:t>If every child rotates around the same origin, rotate the child mesh rather than the root group.</w:t>
+        <w:t>If npm is missing, install the current Node.js LTS release and reopen Terminal.</w:t>
       </w:r>
     </w:p>
     <w:p>
@@ -15745,7 +14948,7 @@
         <w:pStyle w:val="ListBullet"/>
       </w:pPr>
       <w:r>
-        <w:t>If shadows vanish, verify the renderer shadow map, casting light, object castShadow, and floor receiveShadow as one chain.</w:t>
+        <w:t>If the viewport is blank, reload once and check the browser console for WebGL errors.</w:t>
       </w:r>
     </w:p>
     <w:p>
@@ -15753,7 +14956,7 @@
         <w:pStyle w:val="ListBullet"/>
       </w:pPr>
       <w:r>
-        <w:t>If repeated generation slows down, inspect disposal of geometry and materials.</w:t>
+        <w:t>If the inferred mode is wrong, make `AR` explicit or choose the AR override.</w:t>
       </w:r>
     </w:p>
     <w:p>
@@ -15766,7 +14969,7 @@
     </w:p>
     <w:p>
       <w:r>
-        <w:t>Restore the baseline scene, stop the server, and keep the runtime review file.</w:t>
+        <w:t>Stop the Vite server with Control-C. Keep only the exported JSON and evidence screenshots; do not commit `node_modules/` or `.env` files.</w:t>
       </w:r>
     </w:p>
     <w:p>
@@ -15774,7 +14977,7 @@
         <w:rPr>
           <w:i/>
         </w:rPr>
-        <w:t>Detailed lab file: labs/lab-04-scene-graph-lighting-and-animation/README.md</w:t>
+        <w:t>Detailed lab file: labs/lab-01-scene-brief-and-prompt-contract/README.md</w:t>
       </w:r>
     </w:p>
     <w:p>
@@ -15782,7 +14985,7 @@
         <w:pStyle w:val="Heading1"/>
       </w:pPr>
       <w:r>
-        <w:t>Lab 05 — Plane Detection, Hit Test and Anchors</w:t>
+        <w:t>Lab 02 — Storyboard and Spatial UI</w:t>
       </w:r>
     </w:p>
     <w:p>
@@ -15790,13 +14993,30 @@
         <w:rPr>
           <w:b/>
         </w:rPr>
-        <w:t>Duration: 90 minutes · Alignment: LO2 · K5 · K6</w:t>
-      </w:r>
-    </w:p>
-    <w:p>
-      <w:r>
-        <w:t>Place virtual content on a detected real-world surface using viewer-space hit testing and a visible reticle.</w:t>
-      </w:r>
+        <w:t>Duration: 75 minutes · Alignment: LO1 · K1 · K2 · A2</w:t>
+      </w:r>
+    </w:p>
+    <w:p>
+      <w:r>
+        <w:t>Convert an AR user journey into four observable states and apply readable, reachable spatial UI rules.</w:t>
+      </w:r>
+    </w:p>
+    <w:p>
+      <w:r>
+        <w:rPr>
+          <w:b/>
+        </w:rPr>
+        <w:t xml:space="preserve">Try this scene in the live Playground: </w:t>
+      </w:r>
+      <w:hyperlink r:id="rId11">
+        <w:r>
+          <w:rPr>
+            <w:color w:val="0563C1"/>
+            <w:u w:val="single"/>
+          </w:rPr>
+          <w:t>https://alfredang.github.io/arvr-playground/</w:t>
+        </w:r>
+      </w:hyperlink>
     </w:p>
     <w:p>
       <w:pPr>
@@ -15806,7 +15026,7 @@
         <w:drawing>
           <wp:inline xmlns:a="http://schemas.openxmlformats.org/drawingml/2006/main" xmlns:pic="http://schemas.openxmlformats.org/drawingml/2006/picture">
             <wp:extent cx="5989320" cy="3368992"/>
-            <wp:docPr id="8" name="Picture 8"/>
+            <wp:docPr id="5" name="Picture 5"/>
             <wp:cNvGraphicFramePr>
               <a:graphicFrameLocks noChangeAspect="1"/>
             </wp:cNvGraphicFramePr>
@@ -15814,7 +15034,7 @@
               <a:graphicData uri="http://schemas.openxmlformats.org/drawingml/2006/picture">
                 <pic:pic>
                   <pic:nvPicPr>
-                    <pic:cNvPr id="0" name="lab-05-tracked-plane.png"/>
+                    <pic:cNvPr id="0" name="lab-02-tracked-plane.png"/>
                     <pic:cNvPicPr/>
                   </pic:nvPicPr>
                   <pic:blipFill>
@@ -15898,7 +15118,7 @@
         <w:pStyle w:val="ListNumber"/>
       </w:pPr>
       <w:r>
-        <w:t>Study `assets/hit-test-lifecycle.svg`; identify session, viewer space, hit-test source, XRFrame, pose matrix, reticle, and placement states.</w:t>
+        <w:t>Open `assets/storyboard-template.svg` and identify the Entry, Orient, Act, and Confirm evidence required in each frame.</w:t>
       </w:r>
     </w:p>
     <w:p>
@@ -15906,7 +15126,7 @@
         <w:pStyle w:val="ListNumber"/>
       </w:pPr>
       <w:r>
-        <w:t>Locate `hitTestRequested`, `hitTestSource`, `reticle`, and the controller `select` handler in the app.</w:t>
+        <w:t>Start the localhost studio and select the **Storyboard** inspector tab.</w:t>
       </w:r>
     </w:p>
     <w:p>
@@ -15914,7 +15134,7 @@
         <w:pStyle w:val="ListNumber"/>
       </w:pPr>
       <w:r>
-        <w:t>Run the vibe prompt and require the agent to preserve the one-request-per-session invariant.</w:t>
+        <w:t>Run the baseline vibe prompt; confirm the generated sequence contains four distinct states rather than four decorative screens.</w:t>
       </w:r>
     </w:p>
     <w:p>
@@ -15922,7 +15142,7 @@
         <w:pStyle w:val="ListNumber"/>
       </w:pPr>
       <w:r>
-        <w:t>On a supported device, enter AR, move the device until the reticle stabilises on a horizontal surface, then select to place.</w:t>
+        <w:t>Check that Orient exposes plane detection/placement, Act names the interaction, and Confirm shows an observable completion signal.</w:t>
       </w:r>
     </w:p>
     <w:p>
@@ -15930,7 +15150,7 @@
         <w:pStyle w:val="ListNumber"/>
       </w:pPr>
       <w:r>
-        <w:t>On desktop, use the plane grid as evidence and review the same state machine without pretending hit-test support exists.</w:t>
+        <w:t>Use the critique prompt to test label contrast, angular size, occlusion, reachability, and motion comfort.</w:t>
       </w:r>
     </w:p>
     <w:p>
@@ -15938,7 +15158,7 @@
         <w:pStyle w:val="ListNumber"/>
       </w:pPr>
       <w:r>
-        <w:t>End and restart the AR session; verify the old hit-test source is cleared and a new one is requested.</w:t>
+        <w:t>Change one UI constraint, regenerate, and compare the previous and revised contract side by side.</w:t>
       </w:r>
     </w:p>
     <w:p>
@@ -15946,7 +15166,7 @@
         <w:pStyle w:val="ListNumber"/>
       </w:pPr>
       <w:r>
-        <w:t>Capture the reticle, placed object, and session-end evidence; annotate the pose/anchor relationship.</w:t>
+        <w:t>Complete `assets/ui-review-checklist.md` with pass/fail evidence for each rule.</w:t>
       </w:r>
     </w:p>
     <w:p>
@@ -15954,7 +15174,7 @@
         <w:pStyle w:val="ListNumber"/>
       </w:pPr>
       <w:r>
-        <w:t>Run `node verify.mjs`.</w:t>
+        <w:t>Export the scene and run `node verify.mjs`.</w:t>
       </w:r>
     </w:p>
     <w:p>
@@ -15970,7 +15190,7 @@
         <w:pStyle w:val="ListBullet"/>
       </w:pPr>
       <w:r>
-        <w:t>☐ AR uses horizontal-plane hit test</w:t>
+        <w:t>☐ storyboard has four states</w:t>
       </w:r>
     </w:p>
     <w:p>
@@ -15978,7 +15198,7 @@
         <w:pStyle w:val="ListBullet"/>
       </w:pPr>
       <w:r>
-        <w:t>☐ reticle precedes placement</w:t>
+        <w:t>☐ high-contrast labels are enabled</w:t>
       </w:r>
     </w:p>
     <w:p>
@@ -15986,7 +15206,7 @@
         <w:pStyle w:val="ListBullet"/>
       </w:pPr>
       <w:r>
-        <w:t>☐ session cleanup is explicit</w:t>
+        <w:t>☐ reduced-motion control is present</w:t>
       </w:r>
     </w:p>
     <w:p>
@@ -15994,7 +15214,7 @@
         <w:pStyle w:val="ListBullet"/>
       </w:pPr>
       <w:r>
-        <w:t>☐ virtual object scale is metric</w:t>
+        <w:t>☐ tap interaction is declared</w:t>
       </w:r>
     </w:p>
     <w:p>
@@ -16004,7 +15224,7 @@
           <w:color w:val="0B3060"/>
           <w:sz w:val="18"/>
         </w:rPr>
-        <w:t>node labs/lab-05-plane-detection-hit-test-and-anchors/verify.mjs</w:t>
+        <w:t>node labs/lab-02-storyboard-and-spatial-ui/verify.mjs</w:t>
       </w:r>
     </w:p>
     <w:tbl>
@@ -16031,7 +15251,7 @@
               <w:t xml:space="preserve">Expected: </w:t>
             </w:r>
             <w:r>
-              <w:t>The final output is PASS Lab 05.</w:t>
+              <w:t>The final output is PASS Lab 02.</w:t>
             </w:r>
           </w:p>
         </w:tc>
@@ -16050,7 +15270,7 @@
         <w:pStyle w:val="ListBullet"/>
       </w:pPr>
       <w:r>
-        <w:t>No reticle: improve lighting/texture on the physical surface and move the device slowly.</w:t>
+        <w:t>If a storyboard frame is vague, rewrite it as a visible state plus user action plus evidence.</w:t>
       </w:r>
     </w:p>
     <w:p>
@@ -16058,7 +15278,7 @@
         <w:pStyle w:val="ListBullet"/>
       </w:pPr>
       <w:r>
-        <w:t>Object drifts: avoid repeatedly overwriting the placed transform after selection.</w:t>
+        <w:t>If labels disappear, enable Spatial callouts in Runtime controls.</w:t>
       </w:r>
     </w:p>
     <w:p>
@@ -16066,7 +15286,7 @@
         <w:pStyle w:val="ListBullet"/>
       </w:pPr>
       <w:r>
-        <w:t>Session will not launch: confirm WebXR AR support and localhost/HTTPS secure context.</w:t>
+        <w:t>If mobile text is cramped, use the 390 px responsive layout and verify there is no horizontal overflow.</w:t>
       </w:r>
     </w:p>
     <w:p>
@@ -16079,7 +15299,7 @@
     </w:p>
     <w:p>
       <w:r>
-        <w:t>End the immersive session before stopping the server. Retain only non-sensitive room screenshots.</w:t>
+        <w:t>Stop the server and keep the completed UI review plus exported scene in the evidence folder.</w:t>
       </w:r>
     </w:p>
     <w:p>
@@ -16087,7 +15307,7 @@
         <w:rPr>
           <w:i/>
         </w:rPr>
-        <w:t>Detailed lab file: labs/lab-05-plane-detection-hit-test-and-anchors/README.md</w:t>
+        <w:t>Detailed lab file: labs/lab-02-storyboard-and-spatial-ui/README.md</w:t>
       </w:r>
     </w:p>
     <w:p>
@@ -16095,7 +15315,7 @@
         <w:pStyle w:val="Heading1"/>
       </w:pPr>
       <w:r>
-        <w:t>Lab 06 — Raycast, Touch and Spatial Feedback</w:t>
+        <w:t>Lab 03 — WebXR Capability and Equipment Gate</w:t>
       </w:r>
     </w:p>
     <w:p>
@@ -16103,13 +15323,30 @@
         <w:rPr>
           <w:b/>
         </w:rPr>
-        <w:t>Duration: 75 minutes · Alignment: LO2 · K2 · A3</w:t>
-      </w:r>
-    </w:p>
-    <w:p>
-      <w:r>
-        <w:t>Implement selection feedback and diagnose interaction misses using ray origin, direction, target bounds, and state evidence.</w:t>
-      </w:r>
+        <w:t>Duration: 60 minutes · Alignment: LO1 · K3 · K5</w:t>
+      </w:r>
+    </w:p>
+    <w:p>
+      <w:r>
+        <w:t>Detect browser/device capability and route learners to AR, VR, or desktop fallback without a dead-end experience.</w:t>
+      </w:r>
+    </w:p>
+    <w:p>
+      <w:r>
+        <w:rPr>
+          <w:b/>
+        </w:rPr>
+        <w:t xml:space="preserve">Try this scene in the live Playground: </w:t>
+      </w:r>
+      <w:hyperlink r:id="rId11">
+        <w:r>
+          <w:rPr>
+            <w:color w:val="0563C1"/>
+            <w:u w:val="single"/>
+          </w:rPr>
+          <w:t>https://alfredang.github.io/arvr-playground/</w:t>
+        </w:r>
+      </w:hyperlink>
     </w:p>
     <w:p>
       <w:pPr>
@@ -16119,7 +15356,7 @@
         <w:drawing>
           <wp:inline xmlns:a="http://schemas.openxmlformats.org/drawingml/2006/main" xmlns:pic="http://schemas.openxmlformats.org/drawingml/2006/picture">
             <wp:extent cx="5989320" cy="3368992"/>
-            <wp:docPr id="9" name="Picture 9"/>
+            <wp:docPr id="6" name="Picture 6"/>
             <wp:cNvGraphicFramePr>
               <a:graphicFrameLocks noChangeAspect="1"/>
             </wp:cNvGraphicFramePr>
@@ -16127,7 +15364,7 @@
               <a:graphicData uri="http://schemas.openxmlformats.org/drawingml/2006/picture">
                 <pic:pic>
                   <pic:nvPicPr>
-                    <pic:cNvPr id="0" name="lab-06-tracked-plane.png"/>
+                    <pic:cNvPr id="0" name="lab-03-tracked-plane.png"/>
                     <pic:cNvPicPr/>
                   </pic:nvPicPr>
                   <pic:blipFill>
@@ -16211,7 +15448,7 @@
         <w:pStyle w:val="ListNumber"/>
       </w:pPr>
       <w:r>
-        <w:t>Trace the interaction pipeline in `assets/raycast-pipeline.svg` from input coordinates to visible feedback.</w:t>
+        <w:t>Review `assets/capability-matrix.csv` and identify which combinations should enable AR, VR, or desktop preview.</w:t>
       </w:r>
     </w:p>
     <w:p>
@@ -16219,7 +15456,7 @@
         <w:pStyle w:val="ListNumber"/>
       </w:pPr>
       <w:r>
-        <w:t>Generate the four-object scene and predict which object should be selected for an overlapping ray.</w:t>
+        <w:t>Open the studio on desktop and record the actual AR/VR button states.</w:t>
       </w:r>
     </w:p>
     <w:p>
@@ -16227,7 +15464,7 @@
         <w:pStyle w:val="ListNumber"/>
       </w:pPr>
       <w:r>
-        <w:t>Run the vibe prompt; check that the agent treats ray origin/direction, target collection, nearest hit, and feedback as separate states.</w:t>
+        <w:t>Use DevTools Console to inspect `window.isSecureContext`, `navigator.xr`, and WebGL renderer availability.</w:t>
       </w:r>
     </w:p>
     <w:p>
@@ -16235,7 +15472,7 @@
         <w:pStyle w:val="ListNumber"/>
       </w:pPr>
       <w:r>
-        <w:t>Test a successful hit, an empty hit, and two visually overlapping targets.</w:t>
+        <w:t>Run the vibe prompt and require a plan, minimal diff, and automated tests before accepting changes.</w:t>
       </w:r>
     </w:p>
     <w:p>
@@ -16243,7 +15480,7 @@
         <w:pStyle w:val="ListNumber"/>
       </w:pPr>
       <w:r>
-        <w:t>Disable spatial labels and verify selection still has a non-label feedback channel.</w:t>
+        <w:t>Simulate an unsupported browser condition and confirm the app keeps the desktop preview available.</w:t>
       </w:r>
     </w:p>
     <w:p>
@@ -16251,7 +15488,7 @@
         <w:pStyle w:val="ListNumber"/>
       </w:pPr>
       <w:r>
-        <w:t>Use the Checks tab and console evidence to identify whether a miss came from coordinates, camera, layers, bounds, or target registration.</w:t>
+        <w:t>Inspect the user message: it must name the missing capability and the safe next action without blaming cache.</w:t>
       </w:r>
     </w:p>
     <w:p>
@@ -16259,7 +15496,7 @@
         <w:pStyle w:val="ListNumber"/>
       </w:pPr>
       <w:r>
-        <w:t>Document one defect and one adjustment in `evidence/interaction-review.md`.</w:t>
+        <w:t>Complete the capability decision table with observed device/browser evidence.</w:t>
       </w:r>
     </w:p>
     <w:p>
@@ -16267,7 +15504,7 @@
         <w:pStyle w:val="ListNumber"/>
       </w:pPr>
       <w:r>
-        <w:t>Run automated and lab verification.</w:t>
+        <w:t>Run `npm test` in `webapp/` and `node verify.mjs` in this lab.</w:t>
       </w:r>
     </w:p>
     <w:p>
@@ -16283,7 +15520,7 @@
         <w:pStyle w:val="ListBullet"/>
       </w:pPr>
       <w:r>
-        <w:t>☐ tap interaction is declared</w:t>
+        <w:t>☐ desktop fallback remains available</w:t>
       </w:r>
     </w:p>
     <w:p>
@@ -16291,7 +15528,7 @@
         <w:pStyle w:val="ListBullet"/>
       </w:pPr>
       <w:r>
-        <w:t>☐ nearest target is selected</w:t>
+        <w:t>☐ mode is explicit</w:t>
       </w:r>
     </w:p>
     <w:p>
@@ -16299,7 +15536,7 @@
         <w:pStyle w:val="ListBullet"/>
       </w:pPr>
       <w:r>
-        <w:t>☐ no-hit state is visible</w:t>
+        <w:t>☐ runtime budget is declared</w:t>
       </w:r>
     </w:p>
     <w:p>
@@ -16307,7 +15544,7 @@
         <w:pStyle w:val="ListBullet"/>
       </w:pPr>
       <w:r>
-        <w:t>☐ interaction review identifies a cause and adjustment</w:t>
+        <w:t>☐ unsupported WebXR is communicated</w:t>
       </w:r>
     </w:p>
     <w:p>
@@ -16317,7 +15554,7 @@
           <w:color w:val="0B3060"/>
           <w:sz w:val="18"/>
         </w:rPr>
-        <w:t>node labs/lab-06-raycast-touch-and-spatial-feedback/verify.mjs</w:t>
+        <w:t>node labs/lab-03-webxr-capability-and-equipment-gate/verify.mjs</w:t>
       </w:r>
     </w:p>
     <w:tbl>
@@ -16344,7 +15581,7 @@
               <w:t xml:space="preserve">Expected: </w:t>
             </w:r>
             <w:r>
-              <w:t>The final output is PASS Lab 06.</w:t>
+              <w:t>The final output is PASS Lab 03.</w:t>
             </w:r>
           </w:p>
         </w:tc>
@@ -16363,7 +15600,7 @@
         <w:pStyle w:val="ListBullet"/>
       </w:pPr>
       <w:r>
-        <w:t>Wrong object selected: sort intersections by distance and use the first valid selectable target.</w:t>
+        <w:t>WebXR immersive sessions require HTTPS or localhost; use the exact local URL printed by Vite.</w:t>
       </w:r>
     </w:p>
     <w:p>
@@ -16371,7 +15608,7 @@
         <w:pStyle w:val="ListBullet"/>
       </w:pPr>
       <w:r>
-        <w:t>Touch misses on mobile: calculate pointer coordinates from the canvas bounding rectangle.</w:t>
+        <w:t>Safari desktop may expose no immersive WebXR; use desktop preview for code review.</w:t>
       </w:r>
     </w:p>
     <w:p>
@@ -16379,7 +15616,7 @@
         <w:pStyle w:val="ListBullet"/>
       </w:pPr>
       <w:r>
-        <w:t>Invisible feedback: verify material state is restored when selection changes.</w:t>
+        <w:t>If WebGL is disabled, confirm hardware acceleration before changing application code.</w:t>
       </w:r>
     </w:p>
     <w:p>
@@ -16392,7 +15629,7 @@
     </w:p>
     <w:p>
       <w:r>
-        <w:t>Restore default controls and keep the interaction review as assessment evidence.</w:t>
+        <w:t>Close DevTools device simulation, stop the server, and retain the completed capability matrix.</w:t>
       </w:r>
     </w:p>
     <w:p>
@@ -16400,7 +15637,7 @@
         <w:rPr>
           <w:i/>
         </w:rPr>
-        <w:t>Detailed lab file: labs/lab-06-raycast-touch-and-spatial-feedback/README.md</w:t>
+        <w:t>Detailed lab file: labs/lab-03-webxr-capability-and-equipment-gate/README.md</w:t>
       </w:r>
     </w:p>
     <w:p>
@@ -16408,7 +15645,7 @@
         <w:pStyle w:val="Heading1"/>
       </w:pPr>
       <w:r>
-        <w:t>Lab 07 — Immersive VR, Controllers and Comfort</w:t>
+        <w:t>Lab 04 — Scene Graph, Lighting and Animation</w:t>
       </w:r>
     </w:p>
     <w:p>
@@ -16416,13 +15653,30 @@
         <w:rPr>
           <w:b/>
         </w:rPr>
-        <w:t>Duration: 75 minutes · Alignment: LO3 · K7</w:t>
-      </w:r>
-    </w:p>
-    <w:p>
-      <w:r>
-        <w:t>Convert the same content contract into a VR runtime and distinguish AR overlay constraints from VR room-scale constraints.</w:t>
-      </w:r>
+        <w:t>Duration: 90 minutes · Alignment: LO2 · K4 · K5</w:t>
+      </w:r>
+    </w:p>
+    <w:p>
+      <w:r>
+        <w:t>Build a deterministic Three.js scene graph and explain how transforms, lighting, render loop, and cleanup interact.</w:t>
+      </w:r>
+    </w:p>
+    <w:p>
+      <w:r>
+        <w:rPr>
+          <w:b/>
+        </w:rPr>
+        <w:t xml:space="preserve">Try this scene in the live Playground: </w:t>
+      </w:r>
+      <w:hyperlink r:id="rId11">
+        <w:r>
+          <w:rPr>
+            <w:color w:val="0563C1"/>
+            <w:u w:val="single"/>
+          </w:rPr>
+          <w:t>https://alfredang.github.io/arvr-playground/</w:t>
+        </w:r>
+      </w:hyperlink>
     </w:p>
     <w:p>
       <w:pPr>
@@ -16432,7 +15686,7 @@
         <w:drawing>
           <wp:inline xmlns:a="http://schemas.openxmlformats.org/drawingml/2006/main" xmlns:pic="http://schemas.openxmlformats.org/drawingml/2006/picture">
             <wp:extent cx="5989320" cy="3368992"/>
-            <wp:docPr id="10" name="Picture 10"/>
+            <wp:docPr id="7" name="Picture 7"/>
             <wp:cNvGraphicFramePr>
               <a:graphicFrameLocks noChangeAspect="1"/>
             </wp:cNvGraphicFramePr>
@@ -16440,7 +15694,7 @@
               <a:graphicData uri="http://schemas.openxmlformats.org/drawingml/2006/picture">
                 <pic:pic>
                   <pic:nvPicPr>
-                    <pic:cNvPr id="0" name="lab-07-tracked-plane.png"/>
+                    <pic:cNvPr id="0" name="lab-04-tracked-plane.png"/>
                     <pic:cNvPicPr/>
                   </pic:nvPicPr>
                   <pic:blipFill>
@@ -16524,7 +15778,7 @@
         <w:pStyle w:val="ListNumber"/>
       </w:pPr>
       <w:r>
-        <w:t>Read `assets/ar-vr-decision-table.csv` and predict which requirements change when the real-world camera becomes a fully virtual environment.</w:t>
+        <w:t>Trace `Scene → generatedRoot → Group → Mesh` in `assets/scene-graph.svg` and predict which transform affects every generated object.</w:t>
       </w:r>
     </w:p>
     <w:p>
@@ -16532,7 +15786,7 @@
         <w:pStyle w:val="ListNumber"/>
       </w:pPr>
       <w:r>
-        <w:t>Load the VR template and inspect `targetMode`, `environment`, reference-space origin, guardian, input, and frame-rate target.</w:t>
+        <w:t>Open `webapp/src/main.js`; locate scene creation, `generatedRoot`, `buildGeneratedScene()`, and `setAnimationLoop()`.</w:t>
       </w:r>
     </w:p>
     <w:p>
@@ -16540,7 +15794,7 @@
         <w:pStyle w:val="ListNumber"/>
       </w:pPr>
       <w:r>
-        <w:t>Run the vibe prompt and require a plan that reuses content data while changing only runtime-specific contracts.</w:t>
+        <w:t>Run the vibe prompt and reject any response that replaces tested code without first explaining the object lifecycle.</w:t>
       </w:r>
     </w:p>
     <w:p>
@@ -16548,7 +15802,7 @@
         <w:pStyle w:val="ListNumber"/>
       </w:pPr>
       <w:r>
-        <w:t>Enter VR on a supported headset or use desktop preview to review the controller/teleport contract honestly.</w:t>
+        <w:t>Generate a three-object desktop scene and inspect the hierarchy through console logging or the provided contract.</w:t>
       </w:r>
     </w:p>
     <w:p>
@@ -16556,7 +15810,7 @@
         <w:pStyle w:val="ListNumber"/>
       </w:pPr>
       <w:r>
-        <w:t>Verify seated fallback and reduced-motion controls are represented in the scene contract.</w:t>
+        <w:t>Toggle motion and confirm the render loop changes behaviour without rebuilding the whole scene.</w:t>
       </w:r>
     </w:p>
     <w:p>
@@ -16564,7 +15818,7 @@
         <w:pStyle w:val="ListNumber"/>
       </w:pPr>
       <w:r>
-        <w:t>Complete the AR-versus-VR decision table with technical consequences rather than use-case slogans.</w:t>
+        <w:t>Generate ten variations and watch memory/console output for disposal errors or steadily increasing resources.</w:t>
       </w:r>
     </w:p>
     <w:p>
@@ -16572,7 +15826,7 @@
         <w:pStyle w:val="ListNumber"/>
       </w:pPr>
       <w:r>
-        <w:t>Export the VR scene and capture the contract plus runtime status.</w:t>
+        <w:t>Record the before/after draw-call and FPS evidence in `evidence/runtime-review.md`.</w:t>
       </w:r>
     </w:p>
     <w:p>
@@ -16580,7 +15834,7 @@
         <w:pStyle w:val="ListNumber"/>
       </w:pPr>
       <w:r>
-        <w:t>Run `node verify.mjs`.</w:t>
+        <w:t>Run the webapp tests, production build, and lab verifier.</w:t>
       </w:r>
     </w:p>
     <w:p>
@@ -16596,7 +15850,7 @@
         <w:pStyle w:val="ListBullet"/>
       </w:pPr>
       <w:r>
-        <w:t>☐ target mode is VR</w:t>
+        <w:t>☐ generated root uses metric scale</w:t>
       </w:r>
     </w:p>
     <w:p>
@@ -16604,7 +15858,7 @@
         <w:pStyle w:val="ListBullet"/>
       </w:pPr>
       <w:r>
-        <w:t>☐ local-floor origin is declared</w:t>
+        <w:t>☐ animation can be disabled</w:t>
       </w:r>
     </w:p>
     <w:p>
@@ -16612,7 +15866,7 @@
         <w:pStyle w:val="ListBullet"/>
       </w:pPr>
       <w:r>
-        <w:t>☐ guardian and seated fallback are present</w:t>
+        <w:t>☐ performance budget is explicit</w:t>
       </w:r>
     </w:p>
     <w:p>
@@ -16620,7 +15874,7 @@
         <w:pStyle w:val="ListBullet"/>
       </w:pPr>
       <w:r>
-        <w:t>☐ target frame rate is at least 72 FPS</w:t>
+        <w:t>☐ cleanup/disposal is documented</w:t>
       </w:r>
     </w:p>
     <w:p>
@@ -16630,7 +15884,7 @@
           <w:color w:val="0B3060"/>
           <w:sz w:val="18"/>
         </w:rPr>
-        <w:t>node labs/lab-07-immersive-vr-controllers-and-comfort/verify.mjs</w:t>
+        <w:t>node labs/lab-04-scene-graph-lighting-and-animation/verify.mjs</w:t>
       </w:r>
     </w:p>
     <w:tbl>
@@ -16657,7 +15911,7 @@
               <w:t xml:space="preserve">Expected: </w:t>
             </w:r>
             <w:r>
-              <w:t>The final output is PASS Lab 07.</w:t>
+              <w:t>The final output is PASS Lab 04.</w:t>
             </w:r>
           </w:p>
         </w:tc>
@@ -16676,7 +15930,7 @@
         <w:pStyle w:val="ListBullet"/>
       </w:pPr>
       <w:r>
-        <w:t>VR button disabled: verify `immersive-vr` support and the secure context.</w:t>
+        <w:t>If every child rotates around the same origin, rotate the child mesh rather than the root group.</w:t>
       </w:r>
     </w:p>
     <w:p>
@@ -16684,7 +15938,7 @@
         <w:pStyle w:val="ListBullet"/>
       </w:pPr>
       <w:r>
-        <w:t>Floor height wrong: use local-floor reference space and calibrate the headset boundary.</w:t>
+        <w:t>If shadows vanish, verify the renderer shadow map, casting light, object castShadow, and floor receiveShadow as one chain.</w:t>
       </w:r>
     </w:p>
     <w:p>
@@ -16692,7 +15946,7 @@
         <w:pStyle w:val="ListBullet"/>
       </w:pPr>
       <w:r>
-        <w:t>Discomfort: disable continuous motion and use teleport plus snap turns.</w:t>
+        <w:t>If repeated generation slows down, inspect disposal of geometry and materials.</w:t>
       </w:r>
     </w:p>
     <w:p>
@@ -16705,7 +15959,7 @@
     </w:p>
     <w:p>
       <w:r>
-        <w:t>Exit VR, restore the physical play area, stop the server, and retain the completed decision table.</w:t>
+        <w:t>Restore the baseline scene, stop the server, and keep the runtime review file.</w:t>
       </w:r>
     </w:p>
     <w:p>
@@ -16713,7 +15967,7 @@
         <w:rPr>
           <w:i/>
         </w:rPr>
-        <w:t>Detailed lab file: labs/lab-07-immersive-vr-controllers-and-comfort/README.md</w:t>
+        <w:t>Detailed lab file: labs/lab-04-scene-graph-lighting-and-animation/README.md</w:t>
       </w:r>
     </w:p>
     <w:p>
@@ -16721,7 +15975,7 @@
         <w:pStyle w:val="Heading1"/>
       </w:pPr>
       <w:r>
-        <w:t>Lab 08 — Runtime Review, Optimisation and Handover</w:t>
+        <w:t>Lab 05 — Plane Detection, Hit Test and Anchors</w:t>
       </w:r>
     </w:p>
     <w:p>
@@ -16729,13 +15983,30 @@
         <w:rPr>
           <w:b/>
         </w:rPr>
-        <w:t>Duration: 90 minutes · Alignment: LO3 · A3 · A4</w:t>
-      </w:r>
-    </w:p>
-    <w:p>
-      <w:r>
-        <w:t>Review a generated AR/VR runtime, isolate defects with evidence, implement bounded adjustments, and prepare a reproducible handover.</w:t>
-      </w:r>
+        <w:t>Duration: 90 minutes · Alignment: LO2 · K5 · K6</w:t>
+      </w:r>
+    </w:p>
+    <w:p>
+      <w:r>
+        <w:t>Place virtual content on a detected real-world surface using viewer-space hit testing and a visible reticle.</w:t>
+      </w:r>
+    </w:p>
+    <w:p>
+      <w:r>
+        <w:rPr>
+          <w:b/>
+        </w:rPr>
+        <w:t xml:space="preserve">Try this scene in the live Playground: </w:t>
+      </w:r>
+      <w:hyperlink r:id="rId11">
+        <w:r>
+          <w:rPr>
+            <w:color w:val="0563C1"/>
+            <w:u w:val="single"/>
+          </w:rPr>
+          <w:t>https://alfredang.github.io/arvr-playground/</w:t>
+        </w:r>
+      </w:hyperlink>
     </w:p>
     <w:p>
       <w:pPr>
@@ -16745,7 +16016,7 @@
         <w:drawing>
           <wp:inline xmlns:a="http://schemas.openxmlformats.org/drawingml/2006/main" xmlns:pic="http://schemas.openxmlformats.org/drawingml/2006/picture">
             <wp:extent cx="5989320" cy="3368992"/>
-            <wp:docPr id="11" name="Picture 11"/>
+            <wp:docPr id="8" name="Picture 8"/>
             <wp:cNvGraphicFramePr>
               <a:graphicFrameLocks noChangeAspect="1"/>
             </wp:cNvGraphicFramePr>
@@ -16753,7 +16024,7 @@
               <a:graphicData uri="http://schemas.openxmlformats.org/drawingml/2006/picture">
                 <pic:pic>
                   <pic:nvPicPr>
-                    <pic:cNvPr id="0" name="lab-08-tracked-plane.png"/>
+                    <pic:cNvPr id="0" name="lab-05-tracked-plane.png"/>
                     <pic:cNvPicPr/>
                   </pic:nvPicPr>
                   <pic:blipFill>
@@ -16837,6 +16108,996 @@
         <w:pStyle w:val="ListNumber"/>
       </w:pPr>
       <w:r>
+        <w:t>Study `assets/hit-test-lifecycle.svg`; identify session, viewer space, hit-test source, XRFrame, pose matrix, reticle, and placement states.</w:t>
+      </w:r>
+    </w:p>
+    <w:p>
+      <w:pPr>
+        <w:pStyle w:val="ListNumber"/>
+      </w:pPr>
+      <w:r>
+        <w:t>Locate `hitTestRequested`, `hitTestSource`, `reticle`, and the controller `select` handler in the app.</w:t>
+      </w:r>
+    </w:p>
+    <w:p>
+      <w:pPr>
+        <w:pStyle w:val="ListNumber"/>
+      </w:pPr>
+      <w:r>
+        <w:t>Run the vibe prompt and require the agent to preserve the one-request-per-session invariant.</w:t>
+      </w:r>
+    </w:p>
+    <w:p>
+      <w:pPr>
+        <w:pStyle w:val="ListNumber"/>
+      </w:pPr>
+      <w:r>
+        <w:t>On a supported device, enter AR, move the device until the reticle stabilises on a horizontal surface, then select to place.</w:t>
+      </w:r>
+    </w:p>
+    <w:p>
+      <w:pPr>
+        <w:pStyle w:val="ListNumber"/>
+      </w:pPr>
+      <w:r>
+        <w:t>On desktop, use the plane grid as evidence and review the same state machine without pretending hit-test support exists.</w:t>
+      </w:r>
+    </w:p>
+    <w:p>
+      <w:pPr>
+        <w:pStyle w:val="ListNumber"/>
+      </w:pPr>
+      <w:r>
+        <w:t>End and restart the AR session; verify the old hit-test source is cleared and a new one is requested.</w:t>
+      </w:r>
+    </w:p>
+    <w:p>
+      <w:pPr>
+        <w:pStyle w:val="ListNumber"/>
+      </w:pPr>
+      <w:r>
+        <w:t>Capture the reticle, placed object, and session-end evidence; annotate the pose/anchor relationship.</w:t>
+      </w:r>
+    </w:p>
+    <w:p>
+      <w:pPr>
+        <w:pStyle w:val="ListNumber"/>
+      </w:pPr>
+      <w:r>
+        <w:t>Run `node verify.mjs`.</w:t>
+      </w:r>
+    </w:p>
+    <w:p>
+      <w:pPr>
+        <w:pStyle w:val="Heading2"/>
+      </w:pPr>
+      <w:r>
+        <w:t>Test it</w:t>
+      </w:r>
+    </w:p>
+    <w:p>
+      <w:pPr>
+        <w:pStyle w:val="ListBullet"/>
+      </w:pPr>
+      <w:r>
+        <w:t>☐ AR uses horizontal-plane hit test</w:t>
+      </w:r>
+    </w:p>
+    <w:p>
+      <w:pPr>
+        <w:pStyle w:val="ListBullet"/>
+      </w:pPr>
+      <w:r>
+        <w:t>☐ reticle precedes placement</w:t>
+      </w:r>
+    </w:p>
+    <w:p>
+      <w:pPr>
+        <w:pStyle w:val="ListBullet"/>
+      </w:pPr>
+      <w:r>
+        <w:t>☐ session cleanup is explicit</w:t>
+      </w:r>
+    </w:p>
+    <w:p>
+      <w:pPr>
+        <w:pStyle w:val="ListBullet"/>
+      </w:pPr>
+      <w:r>
+        <w:t>☐ virtual object scale is metric</w:t>
+      </w:r>
+    </w:p>
+    <w:p>
+      <w:r>
+        <w:rPr>
+          <w:rFonts w:ascii="Consolas" w:hAnsi="Consolas"/>
+          <w:color w:val="0B3060"/>
+          <w:sz w:val="18"/>
+        </w:rPr>
+        <w:t>node labs/lab-05-plane-detection-hit-test-and-anchors/verify.mjs</w:t>
+      </w:r>
+    </w:p>
+    <w:tbl>
+      <w:tblPr>
+        <w:tblStyle w:val="TableGrid"/>
+        <w:tblW w:type="auto" w:w="0"/>
+        <w:tblLook w:firstColumn="1" w:firstRow="1" w:lastColumn="0" w:lastRow="0" w:noHBand="0" w:noVBand="1" w:val="04A0"/>
+      </w:tblPr>
+      <w:tblGrid>
+        <w:gridCol w:w="8640"/>
+      </w:tblGrid>
+      <w:tr>
+        <w:tc>
+          <w:tcPr>
+            <w:tcW w:type="dxa" w:w="8640"/>
+            <w:shd w:val="clear" w:color="auto" w:fill="F5F8FC"/>
+          </w:tcPr>
+          <w:p>
+            <w:r>
+              <w:rPr>
+                <w:b/>
+                <w:color w:val="109979"/>
+              </w:rPr>
+              <w:t xml:space="preserve">Expected: </w:t>
+            </w:r>
+            <w:r>
+              <w:t>The final output is PASS Lab 05.</w:t>
+            </w:r>
+          </w:p>
+        </w:tc>
+      </w:tr>
+    </w:tbl>
+    <w:p>
+      <w:pPr>
+        <w:pStyle w:val="Heading2"/>
+      </w:pPr>
+      <w:r>
+        <w:t>Troubleshooting</w:t>
+      </w:r>
+    </w:p>
+    <w:p>
+      <w:pPr>
+        <w:pStyle w:val="ListBullet"/>
+      </w:pPr>
+      <w:r>
+        <w:t>No reticle: improve lighting/texture on the physical surface and move the device slowly.</w:t>
+      </w:r>
+    </w:p>
+    <w:p>
+      <w:pPr>
+        <w:pStyle w:val="ListBullet"/>
+      </w:pPr>
+      <w:r>
+        <w:t>Object drifts: avoid repeatedly overwriting the placed transform after selection.</w:t>
+      </w:r>
+    </w:p>
+    <w:p>
+      <w:pPr>
+        <w:pStyle w:val="ListBullet"/>
+      </w:pPr>
+      <w:r>
+        <w:t>Session will not launch: confirm WebXR AR support and localhost/HTTPS secure context.</w:t>
+      </w:r>
+    </w:p>
+    <w:p>
+      <w:pPr>
+        <w:pStyle w:val="Heading2"/>
+      </w:pPr>
+      <w:r>
+        <w:t>Cleanup</w:t>
+      </w:r>
+    </w:p>
+    <w:p>
+      <w:r>
+        <w:t>End the immersive session before stopping the server. Retain only non-sensitive room screenshots.</w:t>
+      </w:r>
+    </w:p>
+    <w:p>
+      <w:r>
+        <w:rPr>
+          <w:i/>
+        </w:rPr>
+        <w:t>Detailed lab file: labs/lab-05-plane-detection-hit-test-and-anchors/README.md</w:t>
+      </w:r>
+    </w:p>
+    <w:p>
+      <w:pPr>
+        <w:pStyle w:val="Heading1"/>
+      </w:pPr>
+      <w:r>
+        <w:t>Lab 06 — Raycast, Touch and Spatial Feedback</w:t>
+      </w:r>
+    </w:p>
+    <w:p>
+      <w:r>
+        <w:rPr>
+          <w:b/>
+        </w:rPr>
+        <w:t>Duration: 75 minutes · Alignment: LO2 · K2 · A3</w:t>
+      </w:r>
+    </w:p>
+    <w:p>
+      <w:r>
+        <w:t>Implement selection feedback and diagnose interaction misses using ray origin, direction, target bounds, and state evidence.</w:t>
+      </w:r>
+    </w:p>
+    <w:p>
+      <w:r>
+        <w:rPr>
+          <w:b/>
+        </w:rPr>
+        <w:t xml:space="preserve">Try this scene in the live Playground: </w:t>
+      </w:r>
+      <w:hyperlink r:id="rId11">
+        <w:r>
+          <w:rPr>
+            <w:color w:val="0563C1"/>
+            <w:u w:val="single"/>
+          </w:rPr>
+          <w:t>https://alfredang.github.io/arvr-playground/</w:t>
+        </w:r>
+      </w:hyperlink>
+    </w:p>
+    <w:p>
+      <w:pPr>
+        <w:jc w:val="center"/>
+      </w:pPr>
+      <w:r>
+        <w:drawing>
+          <wp:inline xmlns:a="http://schemas.openxmlformats.org/drawingml/2006/main" xmlns:pic="http://schemas.openxmlformats.org/drawingml/2006/picture">
+            <wp:extent cx="5989320" cy="3368992"/>
+            <wp:docPr id="9" name="Picture 9"/>
+            <wp:cNvGraphicFramePr>
+              <a:graphicFrameLocks noChangeAspect="1"/>
+            </wp:cNvGraphicFramePr>
+            <a:graphic>
+              <a:graphicData uri="http://schemas.openxmlformats.org/drawingml/2006/picture">
+                <pic:pic>
+                  <pic:nvPicPr>
+                    <pic:cNvPr id="0" name="lab-06-tracked-plane.png"/>
+                    <pic:cNvPicPr/>
+                  </pic:nvPicPr>
+                  <pic:blipFill>
+                    <a:blip r:embed="rId20"/>
+                    <a:stretch>
+                      <a:fillRect/>
+                    </a:stretch>
+                  </pic:blipFill>
+                  <pic:spPr>
+                    <a:xfrm>
+                      <a:off x="0" y="0"/>
+                      <a:ext cx="5989320" cy="3368992"/>
+                    </a:xfrm>
+                    <a:prstGeom prst="rect"/>
+                  </pic:spPr>
+                </pic:pic>
+              </a:graphicData>
+            </a:graphic>
+          </wp:inline>
+        </w:drawing>
+      </w:r>
+    </w:p>
+    <w:p>
+      <w:pPr>
+        <w:jc w:val="center"/>
+      </w:pPr>
+      <w:r>
+        <w:t>Workflow visual — tracked plane and anchor evidence. Detail is supplied in the lab asset folder.</w:t>
+      </w:r>
+    </w:p>
+    <w:p>
+      <w:pPr>
+        <w:pStyle w:val="Heading2"/>
+      </w:pPr>
+      <w:r>
+        <w:t>Before you start</w:t>
+      </w:r>
+    </w:p>
+    <w:p>
+      <w:pPr>
+        <w:pStyle w:val="ListBullet"/>
+      </w:pPr>
+      <w:r>
+        <w:t>Use a current Node.js LTS release and a Chromium-based browser.</w:t>
+      </w:r>
+    </w:p>
+    <w:p>
+      <w:pPr>
+        <w:pStyle w:val="ListBullet"/>
+      </w:pPr>
+      <w:r>
+        <w:t>Keep credentials, learner data and private client material out of coding-agent prompts.</w:t>
+      </w:r>
+    </w:p>
+    <w:p>
+      <w:pPr>
+        <w:pStyle w:val="ListBullet"/>
+      </w:pPr>
+      <w:r>
+        <w:t>Inspect every proposed diff and require automated plus runtime evidence.</w:t>
+      </w:r>
+    </w:p>
+    <w:p>
+      <w:pPr>
+        <w:pStyle w:val="ListBullet"/>
+      </w:pPr>
+      <w:r>
+        <w:t>Clear a safe physical area before immersive testing.</w:t>
+      </w:r>
+    </w:p>
+    <w:p>
+      <w:pPr>
+        <w:pStyle w:val="Heading2"/>
+      </w:pPr>
+      <w:r>
+        <w:t>Detailed procedure</w:t>
+      </w:r>
+    </w:p>
+    <w:p>
+      <w:pPr>
+        <w:pStyle w:val="ListNumber"/>
+      </w:pPr>
+      <w:r>
+        <w:t>Trace the interaction pipeline in `assets/raycast-pipeline.svg` from input coordinates to visible feedback.</w:t>
+      </w:r>
+    </w:p>
+    <w:p>
+      <w:pPr>
+        <w:pStyle w:val="ListNumber"/>
+      </w:pPr>
+      <w:r>
+        <w:t>Generate the four-object scene and predict which object should be selected for an overlapping ray.</w:t>
+      </w:r>
+    </w:p>
+    <w:p>
+      <w:pPr>
+        <w:pStyle w:val="ListNumber"/>
+      </w:pPr>
+      <w:r>
+        <w:t>Run the vibe prompt; check that the agent treats ray origin/direction, target collection, nearest hit, and feedback as separate states.</w:t>
+      </w:r>
+    </w:p>
+    <w:p>
+      <w:pPr>
+        <w:pStyle w:val="ListNumber"/>
+      </w:pPr>
+      <w:r>
+        <w:t>Test a successful hit, an empty hit, and two visually overlapping targets.</w:t>
+      </w:r>
+    </w:p>
+    <w:p>
+      <w:pPr>
+        <w:pStyle w:val="ListNumber"/>
+      </w:pPr>
+      <w:r>
+        <w:t>Disable spatial labels and verify selection still has a non-label feedback channel.</w:t>
+      </w:r>
+    </w:p>
+    <w:p>
+      <w:pPr>
+        <w:pStyle w:val="ListNumber"/>
+      </w:pPr>
+      <w:r>
+        <w:t>Use the Checks tab and console evidence to identify whether a miss came from coordinates, camera, layers, bounds, or target registration.</w:t>
+      </w:r>
+    </w:p>
+    <w:p>
+      <w:pPr>
+        <w:pStyle w:val="ListNumber"/>
+      </w:pPr>
+      <w:r>
+        <w:t>Document one defect and one adjustment in `evidence/interaction-review.md`.</w:t>
+      </w:r>
+    </w:p>
+    <w:p>
+      <w:pPr>
+        <w:pStyle w:val="ListNumber"/>
+      </w:pPr>
+      <w:r>
+        <w:t>Run automated and lab verification.</w:t>
+      </w:r>
+    </w:p>
+    <w:p>
+      <w:pPr>
+        <w:pStyle w:val="Heading2"/>
+      </w:pPr>
+      <w:r>
+        <w:t>Test it</w:t>
+      </w:r>
+    </w:p>
+    <w:p>
+      <w:pPr>
+        <w:pStyle w:val="ListBullet"/>
+      </w:pPr>
+      <w:r>
+        <w:t>☐ tap interaction is declared</w:t>
+      </w:r>
+    </w:p>
+    <w:p>
+      <w:pPr>
+        <w:pStyle w:val="ListBullet"/>
+      </w:pPr>
+      <w:r>
+        <w:t>☐ nearest target is selected</w:t>
+      </w:r>
+    </w:p>
+    <w:p>
+      <w:pPr>
+        <w:pStyle w:val="ListBullet"/>
+      </w:pPr>
+      <w:r>
+        <w:t>☐ no-hit state is visible</w:t>
+      </w:r>
+    </w:p>
+    <w:p>
+      <w:pPr>
+        <w:pStyle w:val="ListBullet"/>
+      </w:pPr>
+      <w:r>
+        <w:t>☐ interaction review identifies a cause and adjustment</w:t>
+      </w:r>
+    </w:p>
+    <w:p>
+      <w:r>
+        <w:rPr>
+          <w:rFonts w:ascii="Consolas" w:hAnsi="Consolas"/>
+          <w:color w:val="0B3060"/>
+          <w:sz w:val="18"/>
+        </w:rPr>
+        <w:t>node labs/lab-06-raycast-touch-and-spatial-feedback/verify.mjs</w:t>
+      </w:r>
+    </w:p>
+    <w:tbl>
+      <w:tblPr>
+        <w:tblStyle w:val="TableGrid"/>
+        <w:tblW w:type="auto" w:w="0"/>
+        <w:tblLook w:firstColumn="1" w:firstRow="1" w:lastColumn="0" w:lastRow="0" w:noHBand="0" w:noVBand="1" w:val="04A0"/>
+      </w:tblPr>
+      <w:tblGrid>
+        <w:gridCol w:w="8640"/>
+      </w:tblGrid>
+      <w:tr>
+        <w:tc>
+          <w:tcPr>
+            <w:tcW w:type="dxa" w:w="8640"/>
+            <w:shd w:val="clear" w:color="auto" w:fill="F5F8FC"/>
+          </w:tcPr>
+          <w:p>
+            <w:r>
+              <w:rPr>
+                <w:b/>
+                <w:color w:val="109979"/>
+              </w:rPr>
+              <w:t xml:space="preserve">Expected: </w:t>
+            </w:r>
+            <w:r>
+              <w:t>The final output is PASS Lab 06.</w:t>
+            </w:r>
+          </w:p>
+        </w:tc>
+      </w:tr>
+    </w:tbl>
+    <w:p>
+      <w:pPr>
+        <w:pStyle w:val="Heading2"/>
+      </w:pPr>
+      <w:r>
+        <w:t>Troubleshooting</w:t>
+      </w:r>
+    </w:p>
+    <w:p>
+      <w:pPr>
+        <w:pStyle w:val="ListBullet"/>
+      </w:pPr>
+      <w:r>
+        <w:t>Wrong object selected: sort intersections by distance and use the first valid selectable target.</w:t>
+      </w:r>
+    </w:p>
+    <w:p>
+      <w:pPr>
+        <w:pStyle w:val="ListBullet"/>
+      </w:pPr>
+      <w:r>
+        <w:t>Touch misses on mobile: calculate pointer coordinates from the canvas bounding rectangle.</w:t>
+      </w:r>
+    </w:p>
+    <w:p>
+      <w:pPr>
+        <w:pStyle w:val="ListBullet"/>
+      </w:pPr>
+      <w:r>
+        <w:t>Invisible feedback: verify material state is restored when selection changes.</w:t>
+      </w:r>
+    </w:p>
+    <w:p>
+      <w:pPr>
+        <w:pStyle w:val="Heading2"/>
+      </w:pPr>
+      <w:r>
+        <w:t>Cleanup</w:t>
+      </w:r>
+    </w:p>
+    <w:p>
+      <w:r>
+        <w:t>Restore default controls and keep the interaction review as assessment evidence.</w:t>
+      </w:r>
+    </w:p>
+    <w:p>
+      <w:r>
+        <w:rPr>
+          <w:i/>
+        </w:rPr>
+        <w:t>Detailed lab file: labs/lab-06-raycast-touch-and-spatial-feedback/README.md</w:t>
+      </w:r>
+    </w:p>
+    <w:p>
+      <w:pPr>
+        <w:pStyle w:val="Heading1"/>
+      </w:pPr>
+      <w:r>
+        <w:t>Lab 07 — Immersive VR, Controllers and Comfort</w:t>
+      </w:r>
+    </w:p>
+    <w:p>
+      <w:r>
+        <w:rPr>
+          <w:b/>
+        </w:rPr>
+        <w:t>Duration: 75 minutes · Alignment: LO3 · K7</w:t>
+      </w:r>
+    </w:p>
+    <w:p>
+      <w:r>
+        <w:t>Convert the same content contract into a VR runtime and distinguish AR overlay constraints from VR room-scale constraints.</w:t>
+      </w:r>
+    </w:p>
+    <w:p>
+      <w:r>
+        <w:rPr>
+          <w:b/>
+        </w:rPr>
+        <w:t xml:space="preserve">Try this scene in the live Playground: </w:t>
+      </w:r>
+      <w:hyperlink r:id="rId11">
+        <w:r>
+          <w:rPr>
+            <w:color w:val="0563C1"/>
+            <w:u w:val="single"/>
+          </w:rPr>
+          <w:t>https://alfredang.github.io/arvr-playground/</w:t>
+        </w:r>
+      </w:hyperlink>
+    </w:p>
+    <w:p>
+      <w:pPr>
+        <w:jc w:val="center"/>
+      </w:pPr>
+      <w:r>
+        <w:drawing>
+          <wp:inline xmlns:a="http://schemas.openxmlformats.org/drawingml/2006/main" xmlns:pic="http://schemas.openxmlformats.org/drawingml/2006/picture">
+            <wp:extent cx="5989320" cy="3368992"/>
+            <wp:docPr id="10" name="Picture 10"/>
+            <wp:cNvGraphicFramePr>
+              <a:graphicFrameLocks noChangeAspect="1"/>
+            </wp:cNvGraphicFramePr>
+            <a:graphic>
+              <a:graphicData uri="http://schemas.openxmlformats.org/drawingml/2006/picture">
+                <pic:pic>
+                  <pic:nvPicPr>
+                    <pic:cNvPr id="0" name="lab-07-tracked-plane.png"/>
+                    <pic:cNvPicPr/>
+                  </pic:nvPicPr>
+                  <pic:blipFill>
+                    <a:blip r:embed="rId21"/>
+                    <a:stretch>
+                      <a:fillRect/>
+                    </a:stretch>
+                  </pic:blipFill>
+                  <pic:spPr>
+                    <a:xfrm>
+                      <a:off x="0" y="0"/>
+                      <a:ext cx="5989320" cy="3368992"/>
+                    </a:xfrm>
+                    <a:prstGeom prst="rect"/>
+                  </pic:spPr>
+                </pic:pic>
+              </a:graphicData>
+            </a:graphic>
+          </wp:inline>
+        </w:drawing>
+      </w:r>
+    </w:p>
+    <w:p>
+      <w:pPr>
+        <w:jc w:val="center"/>
+      </w:pPr>
+      <w:r>
+        <w:t>Workflow visual — tracked plane and anchor evidence. Detail is supplied in the lab asset folder.</w:t>
+      </w:r>
+    </w:p>
+    <w:p>
+      <w:pPr>
+        <w:pStyle w:val="Heading2"/>
+      </w:pPr>
+      <w:r>
+        <w:t>Before you start</w:t>
+      </w:r>
+    </w:p>
+    <w:p>
+      <w:pPr>
+        <w:pStyle w:val="ListBullet"/>
+      </w:pPr>
+      <w:r>
+        <w:t>Use a current Node.js LTS release and a Chromium-based browser.</w:t>
+      </w:r>
+    </w:p>
+    <w:p>
+      <w:pPr>
+        <w:pStyle w:val="ListBullet"/>
+      </w:pPr>
+      <w:r>
+        <w:t>Keep credentials, learner data and private client material out of coding-agent prompts.</w:t>
+      </w:r>
+    </w:p>
+    <w:p>
+      <w:pPr>
+        <w:pStyle w:val="ListBullet"/>
+      </w:pPr>
+      <w:r>
+        <w:t>Inspect every proposed diff and require automated plus runtime evidence.</w:t>
+      </w:r>
+    </w:p>
+    <w:p>
+      <w:pPr>
+        <w:pStyle w:val="ListBullet"/>
+      </w:pPr>
+      <w:r>
+        <w:t>Clear a safe physical area before immersive testing.</w:t>
+      </w:r>
+    </w:p>
+    <w:p>
+      <w:pPr>
+        <w:pStyle w:val="Heading2"/>
+      </w:pPr>
+      <w:r>
+        <w:t>Detailed procedure</w:t>
+      </w:r>
+    </w:p>
+    <w:p>
+      <w:pPr>
+        <w:pStyle w:val="ListNumber"/>
+      </w:pPr>
+      <w:r>
+        <w:t>Read `assets/ar-vr-decision-table.csv` and predict which requirements change when the real-world camera becomes a fully virtual environment.</w:t>
+      </w:r>
+    </w:p>
+    <w:p>
+      <w:pPr>
+        <w:pStyle w:val="ListNumber"/>
+      </w:pPr>
+      <w:r>
+        <w:t>Load the VR template and inspect `targetMode`, `environment`, reference-space origin, guardian, input, and frame-rate target.</w:t>
+      </w:r>
+    </w:p>
+    <w:p>
+      <w:pPr>
+        <w:pStyle w:val="ListNumber"/>
+      </w:pPr>
+      <w:r>
+        <w:t>Run the vibe prompt and require a plan that reuses content data while changing only runtime-specific contracts.</w:t>
+      </w:r>
+    </w:p>
+    <w:p>
+      <w:pPr>
+        <w:pStyle w:val="ListNumber"/>
+      </w:pPr>
+      <w:r>
+        <w:t>Enter VR on a supported headset or use desktop preview to review the controller/teleport contract honestly.</w:t>
+      </w:r>
+    </w:p>
+    <w:p>
+      <w:pPr>
+        <w:pStyle w:val="ListNumber"/>
+      </w:pPr>
+      <w:r>
+        <w:t>Verify seated fallback and reduced-motion controls are represented in the scene contract.</w:t>
+      </w:r>
+    </w:p>
+    <w:p>
+      <w:pPr>
+        <w:pStyle w:val="ListNumber"/>
+      </w:pPr>
+      <w:r>
+        <w:t>Complete the AR-versus-VR decision table with technical consequences rather than use-case slogans.</w:t>
+      </w:r>
+    </w:p>
+    <w:p>
+      <w:pPr>
+        <w:pStyle w:val="ListNumber"/>
+      </w:pPr>
+      <w:r>
+        <w:t>Export the VR scene and capture the contract plus runtime status.</w:t>
+      </w:r>
+    </w:p>
+    <w:p>
+      <w:pPr>
+        <w:pStyle w:val="ListNumber"/>
+      </w:pPr>
+      <w:r>
+        <w:t>Run `node verify.mjs`.</w:t>
+      </w:r>
+    </w:p>
+    <w:p>
+      <w:pPr>
+        <w:pStyle w:val="Heading2"/>
+      </w:pPr>
+      <w:r>
+        <w:t>Test it</w:t>
+      </w:r>
+    </w:p>
+    <w:p>
+      <w:pPr>
+        <w:pStyle w:val="ListBullet"/>
+      </w:pPr>
+      <w:r>
+        <w:t>☐ target mode is VR</w:t>
+      </w:r>
+    </w:p>
+    <w:p>
+      <w:pPr>
+        <w:pStyle w:val="ListBullet"/>
+      </w:pPr>
+      <w:r>
+        <w:t>☐ local-floor origin is declared</w:t>
+      </w:r>
+    </w:p>
+    <w:p>
+      <w:pPr>
+        <w:pStyle w:val="ListBullet"/>
+      </w:pPr>
+      <w:r>
+        <w:t>☐ guardian and seated fallback are present</w:t>
+      </w:r>
+    </w:p>
+    <w:p>
+      <w:pPr>
+        <w:pStyle w:val="ListBullet"/>
+      </w:pPr>
+      <w:r>
+        <w:t>☐ target frame rate is at least 72 FPS</w:t>
+      </w:r>
+    </w:p>
+    <w:p>
+      <w:r>
+        <w:rPr>
+          <w:rFonts w:ascii="Consolas" w:hAnsi="Consolas"/>
+          <w:color w:val="0B3060"/>
+          <w:sz w:val="18"/>
+        </w:rPr>
+        <w:t>node labs/lab-07-immersive-vr-controllers-and-comfort/verify.mjs</w:t>
+      </w:r>
+    </w:p>
+    <w:tbl>
+      <w:tblPr>
+        <w:tblStyle w:val="TableGrid"/>
+        <w:tblW w:type="auto" w:w="0"/>
+        <w:tblLook w:firstColumn="1" w:firstRow="1" w:lastColumn="0" w:lastRow="0" w:noHBand="0" w:noVBand="1" w:val="04A0"/>
+      </w:tblPr>
+      <w:tblGrid>
+        <w:gridCol w:w="8640"/>
+      </w:tblGrid>
+      <w:tr>
+        <w:tc>
+          <w:tcPr>
+            <w:tcW w:type="dxa" w:w="8640"/>
+            <w:shd w:val="clear" w:color="auto" w:fill="F5F8FC"/>
+          </w:tcPr>
+          <w:p>
+            <w:r>
+              <w:rPr>
+                <w:b/>
+                <w:color w:val="109979"/>
+              </w:rPr>
+              <w:t xml:space="preserve">Expected: </w:t>
+            </w:r>
+            <w:r>
+              <w:t>The final output is PASS Lab 07.</w:t>
+            </w:r>
+          </w:p>
+        </w:tc>
+      </w:tr>
+    </w:tbl>
+    <w:p>
+      <w:pPr>
+        <w:pStyle w:val="Heading2"/>
+      </w:pPr>
+      <w:r>
+        <w:t>Troubleshooting</w:t>
+      </w:r>
+    </w:p>
+    <w:p>
+      <w:pPr>
+        <w:pStyle w:val="ListBullet"/>
+      </w:pPr>
+      <w:r>
+        <w:t>VR button disabled: verify `immersive-vr` support and the secure context.</w:t>
+      </w:r>
+    </w:p>
+    <w:p>
+      <w:pPr>
+        <w:pStyle w:val="ListBullet"/>
+      </w:pPr>
+      <w:r>
+        <w:t>Floor height wrong: use local-floor reference space and calibrate the headset boundary.</w:t>
+      </w:r>
+    </w:p>
+    <w:p>
+      <w:pPr>
+        <w:pStyle w:val="ListBullet"/>
+      </w:pPr>
+      <w:r>
+        <w:t>Discomfort: disable continuous motion and use teleport plus snap turns.</w:t>
+      </w:r>
+    </w:p>
+    <w:p>
+      <w:pPr>
+        <w:pStyle w:val="Heading2"/>
+      </w:pPr>
+      <w:r>
+        <w:t>Cleanup</w:t>
+      </w:r>
+    </w:p>
+    <w:p>
+      <w:r>
+        <w:t>Exit VR, restore the physical play area, stop the server, and retain the completed decision table.</w:t>
+      </w:r>
+    </w:p>
+    <w:p>
+      <w:r>
+        <w:rPr>
+          <w:i/>
+        </w:rPr>
+        <w:t>Detailed lab file: labs/lab-07-immersive-vr-controllers-and-comfort/README.md</w:t>
+      </w:r>
+    </w:p>
+    <w:p>
+      <w:pPr>
+        <w:pStyle w:val="Heading1"/>
+      </w:pPr>
+      <w:r>
+        <w:t>Lab 08 — Runtime Review, Optimisation and Handover</w:t>
+      </w:r>
+    </w:p>
+    <w:p>
+      <w:r>
+        <w:rPr>
+          <w:b/>
+        </w:rPr>
+        <w:t>Duration: 90 minutes · Alignment: LO3 · A3 · A4</w:t>
+      </w:r>
+    </w:p>
+    <w:p>
+      <w:r>
+        <w:t>Review a generated AR/VR runtime, isolate defects with evidence, implement bounded adjustments, and prepare a reproducible handover.</w:t>
+      </w:r>
+    </w:p>
+    <w:p>
+      <w:r>
+        <w:rPr>
+          <w:b/>
+        </w:rPr>
+        <w:t xml:space="preserve">Try this scene in the live Playground: </w:t>
+      </w:r>
+      <w:hyperlink r:id="rId11">
+        <w:r>
+          <w:rPr>
+            <w:color w:val="0563C1"/>
+            <w:u w:val="single"/>
+          </w:rPr>
+          <w:t>https://alfredang.github.io/arvr-playground/</w:t>
+        </w:r>
+      </w:hyperlink>
+    </w:p>
+    <w:p>
+      <w:pPr>
+        <w:jc w:val="center"/>
+      </w:pPr>
+      <w:r>
+        <w:drawing>
+          <wp:inline xmlns:a="http://schemas.openxmlformats.org/drawingml/2006/main" xmlns:pic="http://schemas.openxmlformats.org/drawingml/2006/picture">
+            <wp:extent cx="5989320" cy="3368992"/>
+            <wp:docPr id="11" name="Picture 11"/>
+            <wp:cNvGraphicFramePr>
+              <a:graphicFrameLocks noChangeAspect="1"/>
+            </wp:cNvGraphicFramePr>
+            <a:graphic>
+              <a:graphicData uri="http://schemas.openxmlformats.org/drawingml/2006/picture">
+                <pic:pic>
+                  <pic:nvPicPr>
+                    <pic:cNvPr id="0" name="lab-08-tracked-plane.png"/>
+                    <pic:cNvPicPr/>
+                  </pic:nvPicPr>
+                  <pic:blipFill>
+                    <a:blip r:embed="rId22"/>
+                    <a:stretch>
+                      <a:fillRect/>
+                    </a:stretch>
+                  </pic:blipFill>
+                  <pic:spPr>
+                    <a:xfrm>
+                      <a:off x="0" y="0"/>
+                      <a:ext cx="5989320" cy="3368992"/>
+                    </a:xfrm>
+                    <a:prstGeom prst="rect"/>
+                  </pic:spPr>
+                </pic:pic>
+              </a:graphicData>
+            </a:graphic>
+          </wp:inline>
+        </w:drawing>
+      </w:r>
+    </w:p>
+    <w:p>
+      <w:pPr>
+        <w:jc w:val="center"/>
+      </w:pPr>
+      <w:r>
+        <w:t>Workflow visual — tracked plane and anchor evidence. Detail is supplied in the lab asset folder.</w:t>
+      </w:r>
+    </w:p>
+    <w:p>
+      <w:pPr>
+        <w:pStyle w:val="Heading2"/>
+      </w:pPr>
+      <w:r>
+        <w:t>Before you start</w:t>
+      </w:r>
+    </w:p>
+    <w:p>
+      <w:pPr>
+        <w:pStyle w:val="ListBullet"/>
+      </w:pPr>
+      <w:r>
+        <w:t>Use a current Node.js LTS release and a Chromium-based browser.</w:t>
+      </w:r>
+    </w:p>
+    <w:p>
+      <w:pPr>
+        <w:pStyle w:val="ListBullet"/>
+      </w:pPr>
+      <w:r>
+        <w:t>Keep credentials, learner data and private client material out of coding-agent prompts.</w:t>
+      </w:r>
+    </w:p>
+    <w:p>
+      <w:pPr>
+        <w:pStyle w:val="ListBullet"/>
+      </w:pPr>
+      <w:r>
+        <w:t>Inspect every proposed diff and require automated plus runtime evidence.</w:t>
+      </w:r>
+    </w:p>
+    <w:p>
+      <w:pPr>
+        <w:pStyle w:val="ListBullet"/>
+      </w:pPr>
+      <w:r>
+        <w:t>Clear a safe physical area before immersive testing.</w:t>
+      </w:r>
+    </w:p>
+    <w:p>
+      <w:pPr>
+        <w:pStyle w:val="Heading2"/>
+      </w:pPr>
+      <w:r>
+        <w:t>Detailed procedure</w:t>
+      </w:r>
+    </w:p>
+    <w:p>
+      <w:pPr>
+        <w:pStyle w:val="ListNumber"/>
+      </w:pPr>
+      <w:r>
         <w:t>Open `assets/runtime-review-template.md`; define the expected state, observed state, evidence, cause hypothesis, adjustment, and retest for each defect.</w:t>
       </w:r>
     </w:p>
@@ -17143,9 +17404,15 @@
             <w:tcW w:type="dxa" w:w="2160"/>
           </w:tcPr>
           <w:p>
-            <w:r>
-              <w:t>https://www.tertiarycourses.com.sg/wsq-ai-vibe-coding-for-augmented-reality-ar-applications.html</w:t>
-            </w:r>
+            <w:hyperlink r:id="rId13">
+              <w:r>
+                <w:rPr>
+                  <w:color w:val="0563C1"/>
+                  <w:u w:val="single"/>
+                </w:rPr>
+                <w:t>https://www.tertiarycourses.com.sg/wsq-ai-vibe-coding-for-augmented-reality-ar-applications.html</w:t>
+              </w:r>
+            </w:hyperlink>
           </w:p>
         </w:tc>
         <w:tc>
@@ -17176,37 +17443,43 @@
           </w:tcPr>
           <w:p>
             <w:r>
-              <w:t>W3C WebXR Device API</w:t>
-            </w:r>
-          </w:p>
-        </w:tc>
-        <w:tc>
-          <w:tcPr>
-            <w:tcW w:type="dxa" w:w="2160"/>
-          </w:tcPr>
-          <w:p>
-            <w:r>
-              <w:t>https://www.w3.org/TR/webxr/</w:t>
-            </w:r>
-          </w:p>
-        </w:tc>
-        <w:tc>
-          <w:tcPr>
-            <w:tcW w:type="dxa" w:w="2160"/>
-          </w:tcPr>
-          <w:p>
-            <w:r>
-              <w:t>Session modes, reference spaces, input sources, lifecycle, privacy and comfort</w:t>
-            </w:r>
-          </w:p>
-        </w:tc>
-        <w:tc>
-          <w:tcPr>
-            <w:tcW w:type="dxa" w:w="2160"/>
-          </w:tcPr>
-          <w:p>
-            <w:r>
-              <w:t>9 June 2026 CRD</w:t>
+              <w:t>AR/VR Playground</w:t>
+            </w:r>
+          </w:p>
+        </w:tc>
+        <w:tc>
+          <w:tcPr>
+            <w:tcW w:type="dxa" w:w="2160"/>
+          </w:tcPr>
+          <w:p>
+            <w:hyperlink r:id="rId11">
+              <w:r>
+                <w:rPr>
+                  <w:color w:val="0563C1"/>
+                  <w:u w:val="single"/>
+                </w:rPr>
+                <w:t>https://alfredang.github.io/arvr-playground/</w:t>
+              </w:r>
+            </w:hyperlink>
+          </w:p>
+        </w:tc>
+        <w:tc>
+          <w:tcPr>
+            <w:tcW w:type="dxa" w:w="2160"/>
+          </w:tcPr>
+          <w:p>
+            <w:r>
+              <w:t>Learner-facing static HTML/CSS/JavaScript WebXR practice runtime</w:t>
+            </w:r>
+          </w:p>
+        </w:tc>
+        <w:tc>
+          <w:tcPr>
+            <w:tcW w:type="dxa" w:w="2160"/>
+          </w:tcPr>
+          <w:p>
+            <w:r>
+              <w:t>12 September 2026</w:t>
             </w:r>
           </w:p>
         </w:tc>
@@ -17218,37 +17491,43 @@
           </w:tcPr>
           <w:p>
             <w:r>
-              <w:t>W3C Immersive Web publications</w:t>
-            </w:r>
-          </w:p>
-        </w:tc>
-        <w:tc>
-          <w:tcPr>
-            <w:tcW w:type="dxa" w:w="2160"/>
-          </w:tcPr>
-          <w:p>
-            <w:r>
-              <w:t>https://www.w3.org/groups/wg/immersive-web/publications/</w:t>
-            </w:r>
-          </w:p>
-        </w:tc>
-        <w:tc>
-          <w:tcPr>
-            <w:tcW w:type="dxa" w:w="2160"/>
-          </w:tcPr>
-          <w:p>
-            <w:r>
-              <w:t>AR, hit-test, lighting and depth module status</w:t>
-            </w:r>
-          </w:p>
-        </w:tc>
-        <w:tc>
-          <w:tcPr>
-            <w:tcW w:type="dxa" w:w="2160"/>
-          </w:tcPr>
-          <w:p>
-            <w:r>
-              <w:t>11 September 2026</w:t>
+              <w:t>W3C WebXR Device API</w:t>
+            </w:r>
+          </w:p>
+        </w:tc>
+        <w:tc>
+          <w:tcPr>
+            <w:tcW w:type="dxa" w:w="2160"/>
+          </w:tcPr>
+          <w:p>
+            <w:hyperlink r:id="rId23">
+              <w:r>
+                <w:rPr>
+                  <w:color w:val="0563C1"/>
+                  <w:u w:val="single"/>
+                </w:rPr>
+                <w:t>https://www.w3.org/TR/webxr/</w:t>
+              </w:r>
+            </w:hyperlink>
+          </w:p>
+        </w:tc>
+        <w:tc>
+          <w:tcPr>
+            <w:tcW w:type="dxa" w:w="2160"/>
+          </w:tcPr>
+          <w:p>
+            <w:r>
+              <w:t>Session modes, reference spaces, input sources, lifecycle, privacy and comfort</w:t>
+            </w:r>
+          </w:p>
+        </w:tc>
+        <w:tc>
+          <w:tcPr>
+            <w:tcW w:type="dxa" w:w="2160"/>
+          </w:tcPr>
+          <w:p>
+            <w:r>
+              <w:t>9 June 2026 CRD</w:t>
             </w:r>
           </w:p>
         </w:tc>
@@ -17260,27 +17539,33 @@
           </w:tcPr>
           <w:p>
             <w:r>
-              <w:t>Three.js WebXRManager</w:t>
-            </w:r>
-          </w:p>
-        </w:tc>
-        <w:tc>
-          <w:tcPr>
-            <w:tcW w:type="dxa" w:w="2160"/>
-          </w:tcPr>
-          <w:p>
-            <w:r>
-              <w:t>https://threejs.org/docs/pages/WebXRManager.html</w:t>
-            </w:r>
-          </w:p>
-        </w:tc>
-        <w:tc>
-          <w:tcPr>
-            <w:tcW w:type="dxa" w:w="2160"/>
-          </w:tcPr>
-          <w:p>
-            <w:r>
-              <w:t>Renderer XR manager, sessions, controllers and reference space</w:t>
+              <w:t>W3C Immersive Web publications</w:t>
+            </w:r>
+          </w:p>
+        </w:tc>
+        <w:tc>
+          <w:tcPr>
+            <w:tcW w:type="dxa" w:w="2160"/>
+          </w:tcPr>
+          <w:p>
+            <w:hyperlink r:id="rId24">
+              <w:r>
+                <w:rPr>
+                  <w:color w:val="0563C1"/>
+                  <w:u w:val="single"/>
+                </w:rPr>
+                <w:t>https://www.w3.org/groups/wg/immersive-web/publications/</w:t>
+              </w:r>
+            </w:hyperlink>
+          </w:p>
+        </w:tc>
+        <w:tc>
+          <w:tcPr>
+            <w:tcW w:type="dxa" w:w="2160"/>
+          </w:tcPr>
+          <w:p>
+            <w:r>
+              <w:t>AR, hit-test, lighting and depth module status</w:t>
             </w:r>
           </w:p>
         </w:tc>
@@ -17302,27 +17587,33 @@
           </w:tcPr>
           <w:p>
             <w:r>
-              <w:t>Three.js WebGLRenderer</w:t>
-            </w:r>
-          </w:p>
-        </w:tc>
-        <w:tc>
-          <w:tcPr>
-            <w:tcW w:type="dxa" w:w="2160"/>
-          </w:tcPr>
-          <w:p>
-            <w:r>
-              <w:t>https://threejs.org/docs/pages/WebGLRenderer.html</w:t>
-            </w:r>
-          </w:p>
-        </w:tc>
-        <w:tc>
-          <w:tcPr>
-            <w:tcW w:type="dxa" w:w="2160"/>
-          </w:tcPr>
-          <w:p>
-            <w:r>
-              <w:t>setAnimationLoop and renderer lifecycle</w:t>
+              <w:t>Three.js WebXRManager</w:t>
+            </w:r>
+          </w:p>
+        </w:tc>
+        <w:tc>
+          <w:tcPr>
+            <w:tcW w:type="dxa" w:w="2160"/>
+          </w:tcPr>
+          <w:p>
+            <w:hyperlink r:id="rId25">
+              <w:r>
+                <w:rPr>
+                  <w:color w:val="0563C1"/>
+                  <w:u w:val="single"/>
+                </w:rPr>
+                <w:t>https://threejs.org/docs/pages/WebXRManager.html</w:t>
+              </w:r>
+            </w:hyperlink>
+          </w:p>
+        </w:tc>
+        <w:tc>
+          <w:tcPr>
+            <w:tcW w:type="dxa" w:w="2160"/>
+          </w:tcPr>
+          <w:p>
+            <w:r>
+              <w:t>Renderer XR manager, sessions, controllers and reference space</w:t>
             </w:r>
           </w:p>
         </w:tc>
@@ -17344,6 +17635,54 @@
           </w:tcPr>
           <w:p>
             <w:r>
+              <w:t>Three.js WebGLRenderer</w:t>
+            </w:r>
+          </w:p>
+        </w:tc>
+        <w:tc>
+          <w:tcPr>
+            <w:tcW w:type="dxa" w:w="2160"/>
+          </w:tcPr>
+          <w:p>
+            <w:hyperlink r:id="rId26">
+              <w:r>
+                <w:rPr>
+                  <w:color w:val="0563C1"/>
+                  <w:u w:val="single"/>
+                </w:rPr>
+                <w:t>https://threejs.org/docs/pages/WebGLRenderer.html</w:t>
+              </w:r>
+            </w:hyperlink>
+          </w:p>
+        </w:tc>
+        <w:tc>
+          <w:tcPr>
+            <w:tcW w:type="dxa" w:w="2160"/>
+          </w:tcPr>
+          <w:p>
+            <w:r>
+              <w:t>setAnimationLoop and renderer lifecycle</w:t>
+            </w:r>
+          </w:p>
+        </w:tc>
+        <w:tc>
+          <w:tcPr>
+            <w:tcW w:type="dxa" w:w="2160"/>
+          </w:tcPr>
+          <w:p>
+            <w:r>
+              <w:t>11 September 2026</w:t>
+            </w:r>
+          </w:p>
+        </w:tc>
+      </w:tr>
+      <w:tr>
+        <w:tc>
+          <w:tcPr>
+            <w:tcW w:type="dxa" w:w="2160"/>
+          </w:tcPr>
+          <w:p>
+            <w:r>
               <w:t>Three.js ARButton</w:t>
             </w:r>
           </w:p>
@@ -17353,9 +17692,15 @@
             <w:tcW w:type="dxa" w:w="2160"/>
           </w:tcPr>
           <w:p>
-            <w:r>
-              <w:t>https://threejs.org/docs/pages/ARButton.html</w:t>
-            </w:r>
+            <w:hyperlink r:id="rId27">
+              <w:r>
+                <w:rPr>
+                  <w:color w:val="0563C1"/>
+                  <w:u w:val="single"/>
+                </w:rPr>
+                <w:t>https://threejs.org/docs/pages/ARButton.html</w:t>
+              </w:r>
+            </w:hyperlink>
           </w:p>
         </w:tc>
         <w:tc>
@@ -17423,7 +17768,7 @@
       </w:tr>
     </w:tbl>
     <w:sectPr>
-      <w:footerReference w:type="default" r:id="rId20"/>
+      <w:footerReference w:type="default" r:id="rId28"/>
       <w:pgSz w:w="12240" w:h="15840"/>
       <w:pgMar w:top="1440" w:right="1800" w:bottom="1440" w:left="1800" w:header="720" w:footer="720" w:gutter="0"/>
       <w:cols w:space="720"/>

</xml_diff>